<commit_message>
Lab4 done, Lab5 work in progress
</commit_message>
<xml_diff>
--- a/Lab4/4_Рудин.docx
+++ b/Lab4/4_Рудин.docx
@@ -151,15 +151,7 @@
           <w:sz w:val="40"/>
           <w:szCs w:val="40"/>
         </w:rPr>
-        <w:t xml:space="preserve"> № </w:t>
-      </w:r>
-      <w:r>
-        <w:rPr>
-          <w:b/>
-          <w:sz w:val="40"/>
-          <w:szCs w:val="40"/>
-        </w:rPr>
-        <w:t>4</w:t>
+        <w:t xml:space="preserve"> № 4</w:t>
       </w:r>
     </w:p>
     <w:p>
@@ -3284,7 +3276,6 @@
               <w:rPr>
                 <w:sz w:val="26"/>
                 <w:szCs w:val="26"/>
-                <w:lang w:val="en-US"/>
               </w:rPr>
             </w:pPr>
             <w:r>
@@ -3309,6 +3300,13 @@
                 <w:lang w:val="en-US"/>
               </w:rPr>
               <w:t>0</w:t>
+            </w:r>
+            <w:r>
+              <w:rPr>
+                <w:sz w:val="26"/>
+                <w:szCs w:val="26"/>
+              </w:rPr>
+              <w:t>000</w:t>
             </w:r>
           </w:p>
         </w:tc>
@@ -3354,34 +3352,12 @@
               </w:rPr>
               <w:t>0</w:t>
             </w:r>
-          </w:p>
-        </w:tc>
-        <w:tc>
-          <w:tcPr>
-            <w:tcW w:w="1323" w:type="dxa"/>
-          </w:tcPr>
-          <w:p>
-            <w:pPr>
-              <w:jc w:val="both"/>
-              <w:rPr>
-                <w:sz w:val="26"/>
-                <w:szCs w:val="26"/>
-              </w:rPr>
-            </w:pPr>
             <w:r>
               <w:rPr>
                 <w:sz w:val="26"/>
                 <w:szCs w:val="26"/>
-                <w:lang w:val="en-US"/>
-              </w:rPr>
-              <w:t>1</w:t>
-            </w:r>
-            <w:r>
-              <w:rPr>
-                <w:sz w:val="26"/>
-                <w:szCs w:val="26"/>
-              </w:rPr>
-              <w:t>,2</w:t>
+              </w:rPr>
+              <w:t>00</w:t>
             </w:r>
           </w:p>
         </w:tc>
@@ -3410,7 +3386,50 @@
                 <w:sz w:val="26"/>
                 <w:szCs w:val="26"/>
               </w:rPr>
+              <w:t>,2</w:t>
+            </w:r>
+            <w:r>
+              <w:rPr>
+                <w:sz w:val="26"/>
+                <w:szCs w:val="26"/>
+              </w:rPr>
+              <w:t>000</w:t>
+            </w:r>
+          </w:p>
+        </w:tc>
+        <w:tc>
+          <w:tcPr>
+            <w:tcW w:w="1323" w:type="dxa"/>
+          </w:tcPr>
+          <w:p>
+            <w:pPr>
+              <w:jc w:val="both"/>
+              <w:rPr>
+                <w:sz w:val="26"/>
+                <w:szCs w:val="26"/>
+              </w:rPr>
+            </w:pPr>
+            <w:r>
+              <w:rPr>
+                <w:sz w:val="26"/>
+                <w:szCs w:val="26"/>
+                <w:lang w:val="en-US"/>
+              </w:rPr>
+              <w:t>1</w:t>
+            </w:r>
+            <w:r>
+              <w:rPr>
+                <w:sz w:val="26"/>
+                <w:szCs w:val="26"/>
+              </w:rPr>
               <w:t>,30</w:t>
+            </w:r>
+            <w:r>
+              <w:rPr>
+                <w:sz w:val="26"/>
+                <w:szCs w:val="26"/>
+              </w:rPr>
+              <w:t>00</w:t>
             </w:r>
           </w:p>
         </w:tc>
@@ -3489,6 +3508,13 @@
                 <w:szCs w:val="26"/>
               </w:rPr>
             </w:pPr>
+            <w:r>
+              <w:rPr>
+                <w:sz w:val="26"/>
+                <w:szCs w:val="26"/>
+              </w:rPr>
+              <w:t>-0.4161</w:t>
+            </w:r>
           </w:p>
         </w:tc>
         <w:tc>
@@ -3503,6 +3529,13 @@
                 <w:szCs w:val="26"/>
               </w:rPr>
             </w:pPr>
+            <w:r>
+              <w:rPr>
+                <w:sz w:val="26"/>
+                <w:szCs w:val="26"/>
+              </w:rPr>
+              <w:t>-0.5885</w:t>
+            </w:r>
           </w:p>
         </w:tc>
         <w:tc>
@@ -3517,6 +3550,13 @@
                 <w:szCs w:val="26"/>
               </w:rPr>
             </w:pPr>
+            <w:r>
+              <w:rPr>
+                <w:sz w:val="26"/>
+                <w:szCs w:val="26"/>
+              </w:rPr>
+              <w:t>-0.7374</w:t>
+            </w:r>
           </w:p>
         </w:tc>
         <w:tc>
@@ -3531,6 +3571,13 @@
                 <w:szCs w:val="26"/>
               </w:rPr>
             </w:pPr>
+            <w:r>
+              <w:rPr>
+                <w:sz w:val="26"/>
+                <w:szCs w:val="26"/>
+              </w:rPr>
+              <w:t>-0.8569</w:t>
+            </w:r>
           </w:p>
         </w:tc>
       </w:tr>
@@ -3548,290 +3595,1366 @@
     <w:p>
       <w:pPr>
         <w:spacing w:line="360" w:lineRule="auto"/>
+        <w:ind w:left="284"/>
         <w:jc w:val="both"/>
         <w:rPr>
-          <w:sz w:val="26"/>
-          <w:szCs w:val="26"/>
-        </w:rPr>
-      </w:pPr>
+          <w:sz w:val="28"/>
+          <w:szCs w:val="28"/>
+        </w:rPr>
+      </w:pPr>
+      <w:r>
+        <w:rPr>
+          <w:sz w:val="28"/>
+          <w:szCs w:val="28"/>
+        </w:rPr>
+        <w:t>Составим по таблице интерполяционный многочлен Лагранжа:</w:t>
+      </w:r>
     </w:p>
     <w:p>
       <w:pPr>
+        <w:spacing w:line="360" w:lineRule="auto"/>
+        <w:ind w:left="284"/>
         <w:jc w:val="both"/>
         <w:rPr>
-          <w:b/>
-          <w:sz w:val="26"/>
-          <w:szCs w:val="26"/>
-        </w:rPr>
-      </w:pPr>
-      <w:r>
-        <w:rPr>
-          <w:b/>
-          <w:sz w:val="26"/>
-          <w:szCs w:val="26"/>
-        </w:rPr>
-        <w:t>Задани</w:t>
-      </w:r>
-      <w:r>
-        <w:rPr>
-          <w:b/>
-          <w:sz w:val="26"/>
-          <w:szCs w:val="26"/>
-        </w:rPr>
-        <w:t>е 2.</w:t>
-      </w:r>
-      <w:r>
-        <w:rPr>
-          <w:b/>
-          <w:sz w:val="26"/>
-          <w:szCs w:val="26"/>
-        </w:rPr>
-        <w:t xml:space="preserve"> </w:t>
-      </w:r>
-      <w:r>
-        <w:rPr>
-          <w:b/>
-          <w:sz w:val="26"/>
-          <w:szCs w:val="26"/>
-        </w:rPr>
-        <w:t>Дифференцирование</w:t>
+          <w:sz w:val="28"/>
+          <w:szCs w:val="28"/>
+        </w:rPr>
+      </w:pPr>
+      <w:r>
+        <w:rPr>
+          <w:sz w:val="28"/>
+          <w:szCs w:val="28"/>
+        </w:rPr>
+        <w:t>Общий вид для 4 узлов (n=3):</w:t>
       </w:r>
     </w:p>
     <w:p>
       <w:pPr>
-        <w:jc w:val="both"/>
-        <w:rPr>
-          <w:b/>
-          <w:sz w:val="26"/>
-          <w:szCs w:val="26"/>
-        </w:rPr>
-      </w:pPr>
+        <w:spacing w:line="360" w:lineRule="auto"/>
+        <w:ind w:left="284"/>
+        <w:jc w:val="center"/>
+        <w:rPr>
+          <w:sz w:val="28"/>
+          <w:szCs w:val="28"/>
+        </w:rPr>
+      </w:pPr>
+      <m:oMath>
+        <m:sSub>
+          <m:sSubPr>
+            <m:ctrlPr>
+              <w:rPr>
+                <w:rFonts w:ascii="Cambria Math" w:hAnsi="Cambria Math"/>
+                <w:i/>
+                <w:sz w:val="28"/>
+                <w:szCs w:val="28"/>
+              </w:rPr>
+            </m:ctrlPr>
+          </m:sSubPr>
+          <m:e>
+            <m:r>
+              <w:rPr>
+                <w:rFonts w:ascii="Cambria Math" w:hAnsi="Cambria Math"/>
+                <w:sz w:val="28"/>
+                <w:szCs w:val="28"/>
+              </w:rPr>
+              <m:t>L</m:t>
+            </m:r>
+          </m:e>
+          <m:sub>
+            <m:r>
+              <w:rPr>
+                <w:rFonts w:ascii="Cambria Math" w:hAnsi="Cambria Math"/>
+                <w:sz w:val="28"/>
+                <w:szCs w:val="28"/>
+              </w:rPr>
+              <m:t>3</m:t>
+            </m:r>
+          </m:sub>
+        </m:sSub>
+        <m:d>
+          <m:dPr>
+            <m:ctrlPr>
+              <w:rPr>
+                <w:rFonts w:ascii="Cambria Math" w:hAnsi="Cambria Math"/>
+                <w:i/>
+                <w:sz w:val="28"/>
+                <w:szCs w:val="28"/>
+              </w:rPr>
+            </m:ctrlPr>
+          </m:dPr>
+          <m:e>
+            <m:r>
+              <w:rPr>
+                <w:rFonts w:ascii="Cambria Math" w:hAnsi="Cambria Math"/>
+                <w:sz w:val="28"/>
+                <w:szCs w:val="28"/>
+              </w:rPr>
+              <m:t>x</m:t>
+            </m:r>
+          </m:e>
+        </m:d>
+        <m:r>
+          <w:rPr>
+            <w:rFonts w:ascii="Cambria Math" w:hAnsi="Cambria Math"/>
+            <w:sz w:val="28"/>
+            <w:szCs w:val="28"/>
+          </w:rPr>
+          <m:t>=</m:t>
+        </m:r>
+        <m:nary>
+          <m:naryPr>
+            <m:chr m:val="∑"/>
+            <m:limLoc m:val="undOvr"/>
+            <m:grow m:val="1"/>
+            <m:ctrlPr>
+              <w:rPr>
+                <w:rFonts w:ascii="Cambria Math" w:hAnsi="Cambria Math"/>
+                <w:i/>
+                <w:sz w:val="28"/>
+                <w:szCs w:val="28"/>
+              </w:rPr>
+            </m:ctrlPr>
+          </m:naryPr>
+          <m:sub>
+            <m:r>
+              <w:rPr>
+                <w:rFonts w:ascii="Cambria Math" w:hAnsi="Cambria Math"/>
+                <w:sz w:val="28"/>
+                <w:szCs w:val="28"/>
+              </w:rPr>
+              <m:t>i=0</m:t>
+            </m:r>
+          </m:sub>
+          <m:sup>
+            <m:r>
+              <w:rPr>
+                <w:rFonts w:ascii="Cambria Math" w:hAnsi="Cambria Math"/>
+                <w:sz w:val="28"/>
+                <w:szCs w:val="28"/>
+              </w:rPr>
+              <m:t>3</m:t>
+            </m:r>
+          </m:sup>
+          <m:e>
+            <m:sSub>
+              <m:sSubPr>
+                <m:ctrlPr>
+                  <w:rPr>
+                    <w:rFonts w:ascii="Cambria Math" w:hAnsi="Cambria Math"/>
+                    <w:i/>
+                    <w:sz w:val="28"/>
+                    <w:szCs w:val="28"/>
+                  </w:rPr>
+                </m:ctrlPr>
+              </m:sSubPr>
+              <m:e>
+                <m:r>
+                  <w:rPr>
+                    <w:rFonts w:ascii="Cambria Math" w:hAnsi="Cambria Math"/>
+                    <w:sz w:val="28"/>
+                    <w:szCs w:val="28"/>
+                  </w:rPr>
+                  <m:t>y</m:t>
+                </m:r>
+              </m:e>
+              <m:sub>
+                <m:r>
+                  <w:rPr>
+                    <w:rFonts w:ascii="Cambria Math" w:hAnsi="Cambria Math"/>
+                    <w:sz w:val="28"/>
+                    <w:szCs w:val="28"/>
+                  </w:rPr>
+                  <m:t>i</m:t>
+                </m:r>
+              </m:sub>
+            </m:sSub>
+            <m:sSub>
+              <m:sSubPr>
+                <m:ctrlPr>
+                  <w:rPr>
+                    <w:rFonts w:ascii="Cambria Math" w:hAnsi="Cambria Math"/>
+                    <w:i/>
+                    <w:sz w:val="28"/>
+                    <w:szCs w:val="28"/>
+                  </w:rPr>
+                </m:ctrlPr>
+              </m:sSubPr>
+              <m:e>
+                <m:r>
+                  <w:rPr>
+                    <w:rFonts w:ascii="Cambria Math" w:hAnsi="Cambria Math"/>
+                    <w:sz w:val="28"/>
+                    <w:szCs w:val="28"/>
+                    <w:lang w:val="en-US"/>
+                  </w:rPr>
+                  <m:t>l</m:t>
+                </m:r>
+              </m:e>
+              <m:sub>
+                <m:r>
+                  <w:rPr>
+                    <w:rFonts w:ascii="Cambria Math" w:hAnsi="Cambria Math"/>
+                    <w:sz w:val="28"/>
+                    <w:szCs w:val="28"/>
+                  </w:rPr>
+                  <m:t>i</m:t>
+                </m:r>
+              </m:sub>
+            </m:sSub>
+            <m:d>
+              <m:dPr>
+                <m:ctrlPr>
+                  <w:rPr>
+                    <w:rFonts w:ascii="Cambria Math" w:hAnsi="Cambria Math"/>
+                    <w:i/>
+                    <w:sz w:val="28"/>
+                    <w:szCs w:val="28"/>
+                  </w:rPr>
+                </m:ctrlPr>
+              </m:dPr>
+              <m:e>
+                <m:r>
+                  <w:rPr>
+                    <w:rFonts w:ascii="Cambria Math" w:hAnsi="Cambria Math"/>
+                    <w:sz w:val="28"/>
+                    <w:szCs w:val="28"/>
+                  </w:rPr>
+                  <m:t>x</m:t>
+                </m:r>
+              </m:e>
+            </m:d>
+          </m:e>
+        </m:nary>
+      </m:oMath>
+      <w:r>
+        <w:rPr>
+          <w:sz w:val="28"/>
+          <w:szCs w:val="28"/>
+        </w:rPr>
+        <w:t xml:space="preserve"> , где </w:t>
+      </w:r>
+      <m:oMath>
+        <m:sSub>
+          <m:sSubPr>
+            <m:ctrlPr>
+              <w:rPr>
+                <w:rFonts w:ascii="Cambria Math" w:hAnsi="Cambria Math"/>
+                <w:i/>
+                <w:sz w:val="28"/>
+                <w:szCs w:val="28"/>
+              </w:rPr>
+            </m:ctrlPr>
+          </m:sSubPr>
+          <m:e>
+            <m:r>
+              <w:rPr>
+                <w:rFonts w:ascii="Cambria Math" w:hAnsi="Cambria Math"/>
+                <w:sz w:val="28"/>
+                <w:szCs w:val="28"/>
+              </w:rPr>
+              <m:t>l</m:t>
+            </m:r>
+          </m:e>
+          <m:sub>
+            <m:r>
+              <w:rPr>
+                <w:rFonts w:ascii="Cambria Math" w:hAnsi="Cambria Math"/>
+                <w:sz w:val="28"/>
+                <w:szCs w:val="28"/>
+              </w:rPr>
+              <m:t>i</m:t>
+            </m:r>
+          </m:sub>
+        </m:sSub>
+        <m:d>
+          <m:dPr>
+            <m:ctrlPr>
+              <w:rPr>
+                <w:rFonts w:ascii="Cambria Math" w:hAnsi="Cambria Math"/>
+                <w:i/>
+                <w:sz w:val="28"/>
+                <w:szCs w:val="28"/>
+              </w:rPr>
+            </m:ctrlPr>
+          </m:dPr>
+          <m:e>
+            <m:r>
+              <w:rPr>
+                <w:rFonts w:ascii="Cambria Math" w:hAnsi="Cambria Math"/>
+                <w:sz w:val="28"/>
+                <w:szCs w:val="28"/>
+              </w:rPr>
+              <m:t>x</m:t>
+            </m:r>
+          </m:e>
+        </m:d>
+        <m:r>
+          <w:rPr>
+            <w:rFonts w:ascii="Cambria Math" w:hAnsi="Cambria Math"/>
+            <w:sz w:val="28"/>
+            <w:szCs w:val="28"/>
+          </w:rPr>
+          <m:t>=</m:t>
+        </m:r>
+        <m:nary>
+          <m:naryPr>
+            <m:chr m:val="∏"/>
+            <m:limLoc m:val="undOvr"/>
+            <m:grow m:val="1"/>
+            <m:ctrlPr>
+              <w:rPr>
+                <w:rFonts w:ascii="Cambria Math" w:hAnsi="Cambria Math"/>
+                <w:i/>
+                <w:sz w:val="28"/>
+                <w:szCs w:val="28"/>
+              </w:rPr>
+            </m:ctrlPr>
+          </m:naryPr>
+          <m:sub>
+            <m:r>
+              <w:rPr>
+                <w:rFonts w:ascii="Cambria Math" w:hAnsi="Cambria Math"/>
+                <w:sz w:val="28"/>
+                <w:szCs w:val="28"/>
+              </w:rPr>
+              <m:t>j=0;</m:t>
+            </m:r>
+            <m:r>
+              <w:rPr>
+                <w:rFonts w:ascii="Cambria Math" w:hAnsi="Cambria Math"/>
+                <w:sz w:val="28"/>
+                <w:szCs w:val="28"/>
+                <w:lang w:val="en-US"/>
+              </w:rPr>
+              <m:t>j</m:t>
+            </m:r>
+            <m:r>
+              <w:rPr>
+                <w:rFonts w:ascii="Cambria Math" w:hAnsi="Cambria Math"/>
+                <w:sz w:val="28"/>
+                <w:szCs w:val="28"/>
+              </w:rPr>
+              <m:t>≠</m:t>
+            </m:r>
+            <m:r>
+              <w:rPr>
+                <w:rFonts w:ascii="Cambria Math" w:hAnsi="Cambria Math"/>
+                <w:sz w:val="28"/>
+                <w:szCs w:val="28"/>
+                <w:lang w:val="en-US"/>
+              </w:rPr>
+              <m:t>i</m:t>
+            </m:r>
+          </m:sub>
+          <m:sup>
+            <m:r>
+              <w:rPr>
+                <w:rFonts w:ascii="Cambria Math" w:hAnsi="Cambria Math"/>
+                <w:sz w:val="28"/>
+                <w:szCs w:val="28"/>
+              </w:rPr>
+              <m:t>3</m:t>
+            </m:r>
+          </m:sup>
+          <m:e>
+            <m:f>
+              <m:fPr>
+                <m:ctrlPr>
+                  <w:rPr>
+                    <w:rFonts w:ascii="Cambria Math" w:hAnsi="Cambria Math"/>
+                    <w:i/>
+                    <w:sz w:val="28"/>
+                    <w:szCs w:val="28"/>
+                  </w:rPr>
+                </m:ctrlPr>
+              </m:fPr>
+              <m:num>
+                <m:r>
+                  <w:rPr>
+                    <w:rFonts w:ascii="Cambria Math" w:hAnsi="Cambria Math"/>
+                    <w:sz w:val="28"/>
+                    <w:szCs w:val="28"/>
+                  </w:rPr>
+                  <m:t>x-</m:t>
+                </m:r>
+                <m:sSub>
+                  <m:sSubPr>
+                    <m:ctrlPr>
+                      <w:rPr>
+                        <w:rFonts w:ascii="Cambria Math" w:hAnsi="Cambria Math"/>
+                        <w:i/>
+                        <w:sz w:val="28"/>
+                        <w:szCs w:val="28"/>
+                      </w:rPr>
+                    </m:ctrlPr>
+                  </m:sSubPr>
+                  <m:e>
+                    <m:r>
+                      <w:rPr>
+                        <w:rFonts w:ascii="Cambria Math" w:hAnsi="Cambria Math"/>
+                        <w:sz w:val="28"/>
+                        <w:szCs w:val="28"/>
+                      </w:rPr>
+                      <m:t>x</m:t>
+                    </m:r>
+                  </m:e>
+                  <m:sub>
+                    <m:r>
+                      <w:rPr>
+                        <w:rFonts w:ascii="Cambria Math" w:hAnsi="Cambria Math"/>
+                        <w:sz w:val="28"/>
+                        <w:szCs w:val="28"/>
+                      </w:rPr>
+                      <m:t>j</m:t>
+                    </m:r>
+                  </m:sub>
+                </m:sSub>
+              </m:num>
+              <m:den>
+                <m:sSub>
+                  <m:sSubPr>
+                    <m:ctrlPr>
+                      <w:rPr>
+                        <w:rFonts w:ascii="Cambria Math" w:hAnsi="Cambria Math"/>
+                        <w:i/>
+                        <w:sz w:val="28"/>
+                        <w:szCs w:val="28"/>
+                      </w:rPr>
+                    </m:ctrlPr>
+                  </m:sSubPr>
+                  <m:e>
+                    <m:r>
+                      <w:rPr>
+                        <w:rFonts w:ascii="Cambria Math" w:hAnsi="Cambria Math"/>
+                        <w:sz w:val="28"/>
+                        <w:szCs w:val="28"/>
+                      </w:rPr>
+                      <m:t>x</m:t>
+                    </m:r>
+                  </m:e>
+                  <m:sub>
+                    <m:r>
+                      <w:rPr>
+                        <w:rFonts w:ascii="Cambria Math" w:hAnsi="Cambria Math"/>
+                        <w:sz w:val="28"/>
+                        <w:szCs w:val="28"/>
+                      </w:rPr>
+                      <m:t>i</m:t>
+                    </m:r>
+                  </m:sub>
+                </m:sSub>
+                <m:r>
+                  <w:rPr>
+                    <w:rFonts w:ascii="Cambria Math" w:hAnsi="Cambria Math"/>
+                    <w:sz w:val="28"/>
+                    <w:szCs w:val="28"/>
+                  </w:rPr>
+                  <m:t>-</m:t>
+                </m:r>
+                <m:sSub>
+                  <m:sSubPr>
+                    <m:ctrlPr>
+                      <w:rPr>
+                        <w:rFonts w:ascii="Cambria Math" w:hAnsi="Cambria Math"/>
+                        <w:i/>
+                        <w:sz w:val="28"/>
+                        <w:szCs w:val="28"/>
+                      </w:rPr>
+                    </m:ctrlPr>
+                  </m:sSubPr>
+                  <m:e>
+                    <m:r>
+                      <w:rPr>
+                        <w:rFonts w:ascii="Cambria Math" w:hAnsi="Cambria Math"/>
+                        <w:sz w:val="28"/>
+                        <w:szCs w:val="28"/>
+                      </w:rPr>
+                      <m:t>x</m:t>
+                    </m:r>
+                  </m:e>
+                  <m:sub>
+                    <m:r>
+                      <w:rPr>
+                        <w:rFonts w:ascii="Cambria Math" w:hAnsi="Cambria Math"/>
+                        <w:sz w:val="28"/>
+                        <w:szCs w:val="28"/>
+                      </w:rPr>
+                      <m:t>j</m:t>
+                    </m:r>
+                  </m:sub>
+                </m:sSub>
+              </m:den>
+            </m:f>
+          </m:e>
+        </m:nary>
+      </m:oMath>
     </w:p>
     <w:p>
       <w:pPr>
         <w:spacing w:line="360" w:lineRule="auto"/>
+        <w:ind w:left="284"/>
         <w:jc w:val="both"/>
         <w:rPr>
-          <w:sz w:val="26"/>
-          <w:szCs w:val="26"/>
-        </w:rPr>
-      </w:pPr>
-      <w:r>
-        <w:rPr>
-          <w:sz w:val="26"/>
-          <w:szCs w:val="26"/>
-        </w:rPr>
-        <w:t xml:space="preserve">2) </w:t>
-      </w:r>
-      <w:r>
-        <w:rPr>
-          <w:sz w:val="26"/>
-          <w:szCs w:val="26"/>
-        </w:rPr>
-        <w:t>Вычислить таблицу на</w:t>
-      </w:r>
-      <w:r>
-        <w:rPr>
-          <w:sz w:val="26"/>
-          <w:szCs w:val="26"/>
-        </w:rPr>
-        <w:t xml:space="preserve"> отрезке </w:t>
-      </w:r>
-      <w:r>
-        <w:rPr>
-          <w:sz w:val="26"/>
-          <w:szCs w:val="26"/>
-        </w:rPr>
-        <w:t>[</w:t>
-      </w:r>
-      <w:r>
-        <w:rPr>
-          <w:sz w:val="26"/>
-          <w:szCs w:val="26"/>
-          <w:lang w:val="en-US"/>
-        </w:rPr>
-        <w:t>a</w:t>
-      </w:r>
-      <w:r>
-        <w:rPr>
-          <w:sz w:val="26"/>
-          <w:szCs w:val="26"/>
-        </w:rPr>
-        <w:t>,</w:t>
-      </w:r>
-      <w:r>
-        <w:rPr>
-          <w:sz w:val="26"/>
-          <w:szCs w:val="26"/>
-          <w:lang w:val="en-US"/>
-        </w:rPr>
-        <w:t>b</w:t>
-      </w:r>
-      <w:r>
-        <w:rPr>
-          <w:sz w:val="26"/>
-          <w:szCs w:val="26"/>
-        </w:rPr>
-        <w:t xml:space="preserve">] </w:t>
-      </w:r>
-      <w:r>
-        <w:rPr>
-          <w:sz w:val="26"/>
-          <w:szCs w:val="26"/>
-        </w:rPr>
-        <w:t xml:space="preserve">на </w:t>
-      </w:r>
-      <w:r>
-        <w:rPr>
-          <w:sz w:val="26"/>
-          <w:szCs w:val="26"/>
-        </w:rPr>
-        <w:t>равномерной сетке (</w:t>
-      </w:r>
-      <w:r>
-        <w:rPr>
-          <w:sz w:val="26"/>
-          <w:szCs w:val="26"/>
-        </w:rPr>
-        <w:t>5</w:t>
-      </w:r>
-      <w:r>
-        <w:rPr>
-          <w:sz w:val="26"/>
-          <w:szCs w:val="26"/>
-        </w:rPr>
-        <w:t xml:space="preserve"> узлов), </w:t>
-      </w:r>
-      <w:r>
-        <w:rPr>
-          <w:sz w:val="26"/>
-          <w:szCs w:val="26"/>
-        </w:rPr>
-        <w:t xml:space="preserve">и в этих узлах </w:t>
-      </w:r>
-      <w:r>
-        <w:rPr>
-          <w:sz w:val="26"/>
-          <w:szCs w:val="26"/>
-        </w:rPr>
-        <w:t xml:space="preserve">найти значение первой производной функции по формулам 1-го </w:t>
-      </w:r>
-      <w:r>
-        <w:rPr>
-          <w:sz w:val="26"/>
-          <w:szCs w:val="26"/>
-        </w:rPr>
-        <w:t xml:space="preserve">(левая и правая) </w:t>
-      </w:r>
-      <w:r>
-        <w:rPr>
-          <w:sz w:val="26"/>
-          <w:szCs w:val="26"/>
-        </w:rPr>
-        <w:t>и 2-го порядка точности</w:t>
-      </w:r>
-      <w:r>
-        <w:rPr>
-          <w:sz w:val="26"/>
-          <w:szCs w:val="26"/>
-        </w:rPr>
-        <w:t xml:space="preserve"> (центральная)</w:t>
-      </w:r>
-      <w:r>
-        <w:rPr>
-          <w:sz w:val="26"/>
-          <w:szCs w:val="26"/>
-        </w:rPr>
-        <w:t xml:space="preserve"> и </w:t>
-      </w:r>
-      <w:r>
-        <w:rPr>
-          <w:sz w:val="26"/>
-          <w:szCs w:val="26"/>
-        </w:rPr>
-        <w:t xml:space="preserve">значение </w:t>
-      </w:r>
-      <w:r>
-        <w:rPr>
-          <w:sz w:val="26"/>
-          <w:szCs w:val="26"/>
-        </w:rPr>
-        <w:t>втор</w:t>
-      </w:r>
-      <w:r>
-        <w:rPr>
-          <w:sz w:val="26"/>
-          <w:szCs w:val="26"/>
-        </w:rPr>
-        <w:t>ой</w:t>
-      </w:r>
-      <w:r>
-        <w:rPr>
-          <w:sz w:val="26"/>
-          <w:szCs w:val="26"/>
-        </w:rPr>
-        <w:t xml:space="preserve"> производн</w:t>
-      </w:r>
-      <w:r>
-        <w:rPr>
-          <w:sz w:val="26"/>
-          <w:szCs w:val="26"/>
-        </w:rPr>
-        <w:t>ой</w:t>
-      </w:r>
-      <w:r>
-        <w:rPr>
-          <w:sz w:val="26"/>
-          <w:szCs w:val="26"/>
-        </w:rPr>
-        <w:t xml:space="preserve"> по формулам 2-го порядка точности</w:t>
-      </w:r>
-      <w:r>
-        <w:rPr>
-          <w:sz w:val="26"/>
-          <w:szCs w:val="26"/>
-        </w:rPr>
-        <w:t>,</w:t>
-      </w:r>
-      <w:r>
-        <w:rPr>
-          <w:sz w:val="26"/>
-          <w:szCs w:val="26"/>
-        </w:rPr>
-        <w:t xml:space="preserve"> </w:t>
-      </w:r>
-      <w:r>
-        <w:rPr>
-          <w:sz w:val="26"/>
-          <w:szCs w:val="26"/>
-        </w:rPr>
-        <w:t xml:space="preserve">где это возможно Во всех точках найти точные значения производных. </w:t>
-      </w:r>
-      <w:r>
-        <w:rPr>
-          <w:sz w:val="26"/>
-          <w:szCs w:val="26"/>
-        </w:rPr>
-        <w:t>Оценить погрешность.</w:t>
-      </w:r>
-      <w:r>
-        <w:rPr>
-          <w:sz w:val="26"/>
-          <w:szCs w:val="26"/>
-        </w:rPr>
-        <w:t xml:space="preserve"> Результаты свести в таблицу. Точность – 4 значащих цифры.</w:t>
-      </w:r>
-      <w:r>
-        <w:rPr>
-          <w:sz w:val="26"/>
-          <w:szCs w:val="26"/>
-        </w:rPr>
-        <w:t xml:space="preserve"> </w:t>
-      </w:r>
+          <w:sz w:val="28"/>
+          <w:szCs w:val="28"/>
+        </w:rPr>
+      </w:pPr>
+      <w:r>
+        <w:rPr>
+          <w:sz w:val="28"/>
+          <w:szCs w:val="28"/>
+        </w:rPr>
+        <w:t xml:space="preserve">Окончательный вид: </w:t>
+      </w:r>
+      <m:oMath>
+        <m:r>
+          <w:rPr>
+            <w:rFonts w:ascii="Cambria Math" w:hAnsi="Cambria Math"/>
+            <w:sz w:val="28"/>
+            <w:szCs w:val="28"/>
+          </w:rPr>
+          <m:t>L₃(x) =</m:t>
+        </m:r>
+        <m:r>
+          <w:rPr>
+            <w:rFonts w:ascii="Cambria Math" w:eastAsiaTheme="minorEastAsia" w:hAnsi="Cambria Math"/>
+            <w:sz w:val="28"/>
+            <w:szCs w:val="28"/>
+          </w:rPr>
+          <m:t xml:space="preserve"> </m:t>
+        </m:r>
+        <m:r>
+          <m:rPr>
+            <m:sty m:val="p"/>
+          </m:rPr>
+          <w:rPr>
+            <w:rFonts w:ascii="Cambria Math" w:hAnsi="Cambria Math"/>
+            <w:sz w:val="28"/>
+            <w:szCs w:val="28"/>
+          </w:rPr>
+          <m:t>-0,4161</m:t>
+        </m:r>
+        <m:r>
+          <w:rPr>
+            <w:rFonts w:ascii="Cambria Math" w:eastAsiaTheme="minorEastAsia" w:hAnsi="Cambria Math"/>
+            <w:sz w:val="28"/>
+            <w:szCs w:val="28"/>
+          </w:rPr>
+          <m:t xml:space="preserve">* </m:t>
+        </m:r>
+        <m:f>
+          <m:fPr>
+            <m:ctrlPr>
+              <w:rPr>
+                <w:rFonts w:ascii="Cambria Math" w:eastAsiaTheme="minorEastAsia" w:hAnsi="Cambria Math"/>
+                <w:i/>
+                <w:sz w:val="28"/>
+                <w:szCs w:val="28"/>
+                <w:lang w:val="en-US"/>
+              </w:rPr>
+            </m:ctrlPr>
+          </m:fPr>
+          <m:num>
+            <m:d>
+              <m:dPr>
+                <m:ctrlPr>
+                  <w:rPr>
+                    <w:rFonts w:ascii="Cambria Math" w:eastAsiaTheme="minorEastAsia" w:hAnsi="Cambria Math"/>
+                    <w:i/>
+                    <w:sz w:val="28"/>
+                    <w:szCs w:val="28"/>
+                    <w:lang w:val="en-US"/>
+                  </w:rPr>
+                </m:ctrlPr>
+              </m:dPr>
+              <m:e>
+                <m:r>
+                  <w:rPr>
+                    <w:rFonts w:ascii="Cambria Math" w:eastAsiaTheme="minorEastAsia" w:hAnsi="Cambria Math"/>
+                    <w:sz w:val="28"/>
+                    <w:szCs w:val="28"/>
+                    <w:lang w:val="en-US"/>
+                  </w:rPr>
+                  <m:t>x</m:t>
+                </m:r>
+                <m:r>
+                  <w:rPr>
+                    <w:rFonts w:ascii="Cambria Math" w:eastAsiaTheme="minorEastAsia" w:hAnsi="Cambria Math"/>
+                    <w:sz w:val="28"/>
+                    <w:szCs w:val="28"/>
+                  </w:rPr>
+                  <m:t xml:space="preserve"> - 1,1</m:t>
+                </m:r>
+              </m:e>
+            </m:d>
+            <m:r>
+              <w:rPr>
+                <w:rFonts w:ascii="Cambria Math" w:eastAsiaTheme="minorEastAsia" w:hAnsi="Cambria Math"/>
+                <w:sz w:val="28"/>
+                <w:szCs w:val="28"/>
+              </w:rPr>
+              <m:t xml:space="preserve">* </m:t>
+            </m:r>
+            <m:d>
+              <m:dPr>
+                <m:ctrlPr>
+                  <w:rPr>
+                    <w:rFonts w:ascii="Cambria Math" w:eastAsiaTheme="minorEastAsia" w:hAnsi="Cambria Math"/>
+                    <w:i/>
+                    <w:sz w:val="28"/>
+                    <w:szCs w:val="28"/>
+                    <w:lang w:val="en-US"/>
+                  </w:rPr>
+                </m:ctrlPr>
+              </m:dPr>
+              <m:e>
+                <m:r>
+                  <w:rPr>
+                    <w:rFonts w:ascii="Cambria Math" w:eastAsiaTheme="minorEastAsia" w:hAnsi="Cambria Math"/>
+                    <w:sz w:val="28"/>
+                    <w:szCs w:val="28"/>
+                    <w:lang w:val="en-US"/>
+                  </w:rPr>
+                  <m:t>x</m:t>
+                </m:r>
+                <m:r>
+                  <w:rPr>
+                    <w:rFonts w:ascii="Cambria Math" w:eastAsiaTheme="minorEastAsia" w:hAnsi="Cambria Math"/>
+                    <w:sz w:val="28"/>
+                    <w:szCs w:val="28"/>
+                  </w:rPr>
+                  <m:t xml:space="preserve"> - 1,2</m:t>
+                </m:r>
+              </m:e>
+            </m:d>
+            <m:r>
+              <w:rPr>
+                <w:rFonts w:ascii="Cambria Math" w:eastAsiaTheme="minorEastAsia" w:hAnsi="Cambria Math"/>
+                <w:sz w:val="28"/>
+                <w:szCs w:val="28"/>
+              </w:rPr>
+              <m:t xml:space="preserve">* </m:t>
+            </m:r>
+            <m:d>
+              <m:dPr>
+                <m:ctrlPr>
+                  <w:rPr>
+                    <w:rFonts w:ascii="Cambria Math" w:eastAsiaTheme="minorEastAsia" w:hAnsi="Cambria Math"/>
+                    <w:i/>
+                    <w:sz w:val="28"/>
+                    <w:szCs w:val="28"/>
+                    <w:lang w:val="en-US"/>
+                  </w:rPr>
+                </m:ctrlPr>
+              </m:dPr>
+              <m:e>
+                <m:r>
+                  <w:rPr>
+                    <w:rFonts w:ascii="Cambria Math" w:eastAsiaTheme="minorEastAsia" w:hAnsi="Cambria Math"/>
+                    <w:sz w:val="28"/>
+                    <w:szCs w:val="28"/>
+                    <w:lang w:val="en-US"/>
+                  </w:rPr>
+                  <m:t>x</m:t>
+                </m:r>
+                <m:r>
+                  <w:rPr>
+                    <w:rFonts w:ascii="Cambria Math" w:eastAsiaTheme="minorEastAsia" w:hAnsi="Cambria Math"/>
+                    <w:sz w:val="28"/>
+                    <w:szCs w:val="28"/>
+                  </w:rPr>
+                  <m:t xml:space="preserve"> - 1,3</m:t>
+                </m:r>
+              </m:e>
+            </m:d>
+          </m:num>
+          <m:den>
+            <m:d>
+              <m:dPr>
+                <m:ctrlPr>
+                  <w:rPr>
+                    <w:rFonts w:ascii="Cambria Math" w:eastAsiaTheme="minorEastAsia" w:hAnsi="Cambria Math"/>
+                    <w:i/>
+                    <w:sz w:val="28"/>
+                    <w:szCs w:val="28"/>
+                    <w:lang w:val="en-US"/>
+                  </w:rPr>
+                </m:ctrlPr>
+              </m:dPr>
+              <m:e>
+                <m:r>
+                  <w:rPr>
+                    <w:rFonts w:ascii="Cambria Math" w:eastAsiaTheme="minorEastAsia" w:hAnsi="Cambria Math"/>
+                    <w:sz w:val="28"/>
+                    <w:szCs w:val="28"/>
+                  </w:rPr>
+                  <m:t>1,0-1,1</m:t>
+                </m:r>
+              </m:e>
+            </m:d>
+            <m:r>
+              <w:rPr>
+                <w:rFonts w:ascii="Cambria Math" w:eastAsiaTheme="minorEastAsia" w:hAnsi="Cambria Math"/>
+                <w:sz w:val="28"/>
+                <w:szCs w:val="28"/>
+              </w:rPr>
+              <m:t xml:space="preserve">* </m:t>
+            </m:r>
+            <m:d>
+              <m:dPr>
+                <m:ctrlPr>
+                  <w:rPr>
+                    <w:rFonts w:ascii="Cambria Math" w:eastAsiaTheme="minorEastAsia" w:hAnsi="Cambria Math"/>
+                    <w:i/>
+                    <w:sz w:val="28"/>
+                    <w:szCs w:val="28"/>
+                    <w:lang w:val="en-US"/>
+                  </w:rPr>
+                </m:ctrlPr>
+              </m:dPr>
+              <m:e>
+                <m:r>
+                  <w:rPr>
+                    <w:rFonts w:ascii="Cambria Math" w:eastAsiaTheme="minorEastAsia" w:hAnsi="Cambria Math"/>
+                    <w:sz w:val="28"/>
+                    <w:szCs w:val="28"/>
+                  </w:rPr>
+                  <m:t>1,0 - 1,2</m:t>
+                </m:r>
+              </m:e>
+            </m:d>
+            <m:r>
+              <w:rPr>
+                <w:rFonts w:ascii="Cambria Math" w:eastAsiaTheme="minorEastAsia" w:hAnsi="Cambria Math"/>
+                <w:sz w:val="28"/>
+                <w:szCs w:val="28"/>
+              </w:rPr>
+              <m:t xml:space="preserve">* </m:t>
+            </m:r>
+            <m:d>
+              <m:dPr>
+                <m:ctrlPr>
+                  <w:rPr>
+                    <w:rFonts w:ascii="Cambria Math" w:eastAsiaTheme="minorEastAsia" w:hAnsi="Cambria Math"/>
+                    <w:i/>
+                    <w:sz w:val="28"/>
+                    <w:szCs w:val="28"/>
+                    <w:lang w:val="en-US"/>
+                  </w:rPr>
+                </m:ctrlPr>
+              </m:dPr>
+              <m:e>
+                <m:r>
+                  <w:rPr>
+                    <w:rFonts w:ascii="Cambria Math" w:eastAsiaTheme="minorEastAsia" w:hAnsi="Cambria Math"/>
+                    <w:sz w:val="28"/>
+                    <w:szCs w:val="28"/>
+                  </w:rPr>
+                  <m:t>1,0 - 1,3</m:t>
+                </m:r>
+              </m:e>
+            </m:d>
+          </m:den>
+        </m:f>
+        <m:r>
+          <w:rPr>
+            <w:rFonts w:ascii="Cambria Math" w:eastAsiaTheme="minorEastAsia" w:hAnsi="Cambria Math"/>
+            <w:sz w:val="28"/>
+            <w:szCs w:val="28"/>
+          </w:rPr>
+          <m:t>-</m:t>
+        </m:r>
+        <m:r>
+          <m:rPr>
+            <m:sty m:val="p"/>
+          </m:rPr>
+          <w:rPr>
+            <w:rFonts w:ascii="Cambria Math" w:hAnsi="Cambria Math"/>
+            <w:sz w:val="28"/>
+            <w:szCs w:val="28"/>
+          </w:rPr>
+          <m:t>0,5885</m:t>
+        </m:r>
+        <m:r>
+          <w:rPr>
+            <w:rFonts w:ascii="Cambria Math" w:eastAsiaTheme="minorEastAsia" w:hAnsi="Cambria Math"/>
+            <w:sz w:val="28"/>
+            <w:szCs w:val="28"/>
+          </w:rPr>
+          <m:t xml:space="preserve">* </m:t>
+        </m:r>
+        <m:f>
+          <m:fPr>
+            <m:ctrlPr>
+              <w:rPr>
+                <w:rFonts w:ascii="Cambria Math" w:eastAsiaTheme="minorEastAsia" w:hAnsi="Cambria Math"/>
+                <w:i/>
+                <w:sz w:val="28"/>
+                <w:szCs w:val="28"/>
+                <w:lang w:val="en-US"/>
+              </w:rPr>
+            </m:ctrlPr>
+          </m:fPr>
+          <m:num>
+            <m:d>
+              <m:dPr>
+                <m:ctrlPr>
+                  <w:rPr>
+                    <w:rFonts w:ascii="Cambria Math" w:eastAsiaTheme="minorEastAsia" w:hAnsi="Cambria Math"/>
+                    <w:i/>
+                    <w:sz w:val="28"/>
+                    <w:szCs w:val="28"/>
+                    <w:lang w:val="en-US"/>
+                  </w:rPr>
+                </m:ctrlPr>
+              </m:dPr>
+              <m:e>
+                <m:r>
+                  <w:rPr>
+                    <w:rFonts w:ascii="Cambria Math" w:eastAsiaTheme="minorEastAsia" w:hAnsi="Cambria Math"/>
+                    <w:sz w:val="28"/>
+                    <w:szCs w:val="28"/>
+                    <w:lang w:val="en-US"/>
+                  </w:rPr>
+                  <m:t>x</m:t>
+                </m:r>
+                <m:r>
+                  <w:rPr>
+                    <w:rFonts w:ascii="Cambria Math" w:eastAsiaTheme="minorEastAsia" w:hAnsi="Cambria Math"/>
+                    <w:sz w:val="28"/>
+                    <w:szCs w:val="28"/>
+                  </w:rPr>
+                  <m:t xml:space="preserve"> - 1,0</m:t>
+                </m:r>
+              </m:e>
+            </m:d>
+            <m:r>
+              <w:rPr>
+                <w:rFonts w:ascii="Cambria Math" w:eastAsiaTheme="minorEastAsia" w:hAnsi="Cambria Math"/>
+                <w:sz w:val="28"/>
+                <w:szCs w:val="28"/>
+              </w:rPr>
+              <m:t xml:space="preserve">* </m:t>
+            </m:r>
+            <m:d>
+              <m:dPr>
+                <m:ctrlPr>
+                  <w:rPr>
+                    <w:rFonts w:ascii="Cambria Math" w:eastAsiaTheme="minorEastAsia" w:hAnsi="Cambria Math"/>
+                    <w:i/>
+                    <w:sz w:val="28"/>
+                    <w:szCs w:val="28"/>
+                    <w:lang w:val="en-US"/>
+                  </w:rPr>
+                </m:ctrlPr>
+              </m:dPr>
+              <m:e>
+                <m:r>
+                  <w:rPr>
+                    <w:rFonts w:ascii="Cambria Math" w:eastAsiaTheme="minorEastAsia" w:hAnsi="Cambria Math"/>
+                    <w:sz w:val="28"/>
+                    <w:szCs w:val="28"/>
+                    <w:lang w:val="en-US"/>
+                  </w:rPr>
+                  <m:t>x</m:t>
+                </m:r>
+                <m:r>
+                  <w:rPr>
+                    <w:rFonts w:ascii="Cambria Math" w:eastAsiaTheme="minorEastAsia" w:hAnsi="Cambria Math"/>
+                    <w:sz w:val="28"/>
+                    <w:szCs w:val="28"/>
+                  </w:rPr>
+                  <m:t xml:space="preserve"> - 1,2</m:t>
+                </m:r>
+              </m:e>
+            </m:d>
+            <m:r>
+              <w:rPr>
+                <w:rFonts w:ascii="Cambria Math" w:eastAsiaTheme="minorEastAsia" w:hAnsi="Cambria Math"/>
+                <w:sz w:val="28"/>
+                <w:szCs w:val="28"/>
+              </w:rPr>
+              <m:t xml:space="preserve">* </m:t>
+            </m:r>
+            <m:d>
+              <m:dPr>
+                <m:ctrlPr>
+                  <w:rPr>
+                    <w:rFonts w:ascii="Cambria Math" w:eastAsiaTheme="minorEastAsia" w:hAnsi="Cambria Math"/>
+                    <w:i/>
+                    <w:sz w:val="28"/>
+                    <w:szCs w:val="28"/>
+                    <w:lang w:val="en-US"/>
+                  </w:rPr>
+                </m:ctrlPr>
+              </m:dPr>
+              <m:e>
+                <m:r>
+                  <w:rPr>
+                    <w:rFonts w:ascii="Cambria Math" w:eastAsiaTheme="minorEastAsia" w:hAnsi="Cambria Math"/>
+                    <w:sz w:val="28"/>
+                    <w:szCs w:val="28"/>
+                    <w:lang w:val="en-US"/>
+                  </w:rPr>
+                  <m:t>x</m:t>
+                </m:r>
+                <m:r>
+                  <w:rPr>
+                    <w:rFonts w:ascii="Cambria Math" w:eastAsiaTheme="minorEastAsia" w:hAnsi="Cambria Math"/>
+                    <w:sz w:val="28"/>
+                    <w:szCs w:val="28"/>
+                  </w:rPr>
+                  <m:t xml:space="preserve"> - 1,3</m:t>
+                </m:r>
+              </m:e>
+            </m:d>
+          </m:num>
+          <m:den>
+            <m:d>
+              <m:dPr>
+                <m:ctrlPr>
+                  <w:rPr>
+                    <w:rFonts w:ascii="Cambria Math" w:eastAsiaTheme="minorEastAsia" w:hAnsi="Cambria Math"/>
+                    <w:i/>
+                    <w:sz w:val="28"/>
+                    <w:szCs w:val="28"/>
+                    <w:lang w:val="en-US"/>
+                  </w:rPr>
+                </m:ctrlPr>
+              </m:dPr>
+              <m:e>
+                <m:r>
+                  <w:rPr>
+                    <w:rFonts w:ascii="Cambria Math" w:eastAsiaTheme="minorEastAsia" w:hAnsi="Cambria Math"/>
+                    <w:sz w:val="28"/>
+                    <w:szCs w:val="28"/>
+                  </w:rPr>
+                  <m:t>1,1 - 1,0</m:t>
+                </m:r>
+              </m:e>
+            </m:d>
+            <m:r>
+              <w:rPr>
+                <w:rFonts w:ascii="Cambria Math" w:eastAsiaTheme="minorEastAsia" w:hAnsi="Cambria Math"/>
+                <w:sz w:val="28"/>
+                <w:szCs w:val="28"/>
+              </w:rPr>
+              <m:t xml:space="preserve">* </m:t>
+            </m:r>
+            <m:d>
+              <m:dPr>
+                <m:ctrlPr>
+                  <w:rPr>
+                    <w:rFonts w:ascii="Cambria Math" w:eastAsiaTheme="minorEastAsia" w:hAnsi="Cambria Math"/>
+                    <w:i/>
+                    <w:sz w:val="28"/>
+                    <w:szCs w:val="28"/>
+                    <w:lang w:val="en-US"/>
+                  </w:rPr>
+                </m:ctrlPr>
+              </m:dPr>
+              <m:e>
+                <m:r>
+                  <w:rPr>
+                    <w:rFonts w:ascii="Cambria Math" w:eastAsiaTheme="minorEastAsia" w:hAnsi="Cambria Math"/>
+                    <w:sz w:val="28"/>
+                    <w:szCs w:val="28"/>
+                  </w:rPr>
+                  <m:t>1,1 - 1,2</m:t>
+                </m:r>
+              </m:e>
+            </m:d>
+            <m:r>
+              <w:rPr>
+                <w:rFonts w:ascii="Cambria Math" w:eastAsiaTheme="minorEastAsia" w:hAnsi="Cambria Math"/>
+                <w:sz w:val="28"/>
+                <w:szCs w:val="28"/>
+              </w:rPr>
+              <m:t xml:space="preserve">* </m:t>
+            </m:r>
+            <m:d>
+              <m:dPr>
+                <m:ctrlPr>
+                  <w:rPr>
+                    <w:rFonts w:ascii="Cambria Math" w:eastAsiaTheme="minorEastAsia" w:hAnsi="Cambria Math"/>
+                    <w:i/>
+                    <w:sz w:val="28"/>
+                    <w:szCs w:val="28"/>
+                    <w:lang w:val="en-US"/>
+                  </w:rPr>
+                </m:ctrlPr>
+              </m:dPr>
+              <m:e>
+                <m:r>
+                  <w:rPr>
+                    <w:rFonts w:ascii="Cambria Math" w:eastAsiaTheme="minorEastAsia" w:hAnsi="Cambria Math"/>
+                    <w:sz w:val="28"/>
+                    <w:szCs w:val="28"/>
+                  </w:rPr>
+                  <m:t>1,1 - 1,3</m:t>
+                </m:r>
+              </m:e>
+            </m:d>
+          </m:den>
+        </m:f>
+        <m:r>
+          <w:rPr>
+            <w:rFonts w:ascii="Cambria Math" w:eastAsiaTheme="minorEastAsia" w:hAnsi="Cambria Math"/>
+            <w:sz w:val="28"/>
+            <w:szCs w:val="28"/>
+          </w:rPr>
+          <m:t xml:space="preserve">- </m:t>
+        </m:r>
+        <m:r>
+          <m:rPr>
+            <m:sty m:val="p"/>
+          </m:rPr>
+          <w:rPr>
+            <w:rFonts w:ascii="Cambria Math" w:hAnsi="Cambria Math"/>
+            <w:sz w:val="28"/>
+            <w:szCs w:val="28"/>
+          </w:rPr>
+          <m:t>0,7374</m:t>
+        </m:r>
+        <m:r>
+          <w:rPr>
+            <w:rFonts w:ascii="Cambria Math" w:eastAsiaTheme="minorEastAsia" w:hAnsi="Cambria Math"/>
+            <w:sz w:val="28"/>
+            <w:szCs w:val="28"/>
+          </w:rPr>
+          <m:t xml:space="preserve">* </m:t>
+        </m:r>
+        <m:f>
+          <m:fPr>
+            <m:ctrlPr>
+              <w:rPr>
+                <w:rFonts w:ascii="Cambria Math" w:eastAsiaTheme="minorEastAsia" w:hAnsi="Cambria Math"/>
+                <w:i/>
+                <w:sz w:val="28"/>
+                <w:szCs w:val="28"/>
+                <w:lang w:val="en-US"/>
+              </w:rPr>
+            </m:ctrlPr>
+          </m:fPr>
+          <m:num>
+            <m:d>
+              <m:dPr>
+                <m:ctrlPr>
+                  <w:rPr>
+                    <w:rFonts w:ascii="Cambria Math" w:eastAsiaTheme="minorEastAsia" w:hAnsi="Cambria Math"/>
+                    <w:i/>
+                    <w:sz w:val="28"/>
+                    <w:szCs w:val="28"/>
+                    <w:lang w:val="en-US"/>
+                  </w:rPr>
+                </m:ctrlPr>
+              </m:dPr>
+              <m:e>
+                <m:r>
+                  <w:rPr>
+                    <w:rFonts w:ascii="Cambria Math" w:eastAsiaTheme="minorEastAsia" w:hAnsi="Cambria Math"/>
+                    <w:sz w:val="28"/>
+                    <w:szCs w:val="28"/>
+                    <w:lang w:val="en-US"/>
+                  </w:rPr>
+                  <m:t>x</m:t>
+                </m:r>
+                <m:r>
+                  <w:rPr>
+                    <w:rFonts w:ascii="Cambria Math" w:eastAsiaTheme="minorEastAsia" w:hAnsi="Cambria Math"/>
+                    <w:sz w:val="28"/>
+                    <w:szCs w:val="28"/>
+                  </w:rPr>
+                  <m:t xml:space="preserve"> -1,0</m:t>
+                </m:r>
+              </m:e>
+            </m:d>
+            <m:r>
+              <w:rPr>
+                <w:rFonts w:ascii="Cambria Math" w:eastAsiaTheme="minorEastAsia" w:hAnsi="Cambria Math"/>
+                <w:sz w:val="28"/>
+                <w:szCs w:val="28"/>
+              </w:rPr>
+              <m:t xml:space="preserve">* </m:t>
+            </m:r>
+            <m:d>
+              <m:dPr>
+                <m:ctrlPr>
+                  <w:rPr>
+                    <w:rFonts w:ascii="Cambria Math" w:eastAsiaTheme="minorEastAsia" w:hAnsi="Cambria Math"/>
+                    <w:i/>
+                    <w:sz w:val="28"/>
+                    <w:szCs w:val="28"/>
+                    <w:lang w:val="en-US"/>
+                  </w:rPr>
+                </m:ctrlPr>
+              </m:dPr>
+              <m:e>
+                <m:r>
+                  <w:rPr>
+                    <w:rFonts w:ascii="Cambria Math" w:eastAsiaTheme="minorEastAsia" w:hAnsi="Cambria Math"/>
+                    <w:sz w:val="28"/>
+                    <w:szCs w:val="28"/>
+                    <w:lang w:val="en-US"/>
+                  </w:rPr>
+                  <m:t>x</m:t>
+                </m:r>
+                <m:r>
+                  <w:rPr>
+                    <w:rFonts w:ascii="Cambria Math" w:eastAsiaTheme="minorEastAsia" w:hAnsi="Cambria Math"/>
+                    <w:sz w:val="28"/>
+                    <w:szCs w:val="28"/>
+                  </w:rPr>
+                  <m:t xml:space="preserve"> - 1,1</m:t>
+                </m:r>
+              </m:e>
+            </m:d>
+            <m:r>
+              <w:rPr>
+                <w:rFonts w:ascii="Cambria Math" w:eastAsiaTheme="minorEastAsia" w:hAnsi="Cambria Math"/>
+                <w:sz w:val="28"/>
+                <w:szCs w:val="28"/>
+              </w:rPr>
+              <m:t xml:space="preserve">* </m:t>
+            </m:r>
+            <m:d>
+              <m:dPr>
+                <m:ctrlPr>
+                  <w:rPr>
+                    <w:rFonts w:ascii="Cambria Math" w:eastAsiaTheme="minorEastAsia" w:hAnsi="Cambria Math"/>
+                    <w:i/>
+                    <w:sz w:val="28"/>
+                    <w:szCs w:val="28"/>
+                    <w:lang w:val="en-US"/>
+                  </w:rPr>
+                </m:ctrlPr>
+              </m:dPr>
+              <m:e>
+                <m:r>
+                  <w:rPr>
+                    <w:rFonts w:ascii="Cambria Math" w:eastAsiaTheme="minorEastAsia" w:hAnsi="Cambria Math"/>
+                    <w:sz w:val="28"/>
+                    <w:szCs w:val="28"/>
+                    <w:lang w:val="en-US"/>
+                  </w:rPr>
+                  <m:t>x</m:t>
+                </m:r>
+                <m:r>
+                  <w:rPr>
+                    <w:rFonts w:ascii="Cambria Math" w:eastAsiaTheme="minorEastAsia" w:hAnsi="Cambria Math"/>
+                    <w:sz w:val="28"/>
+                    <w:szCs w:val="28"/>
+                  </w:rPr>
+                  <m:t xml:space="preserve"> - 1,3</m:t>
+                </m:r>
+              </m:e>
+            </m:d>
+          </m:num>
+          <m:den>
+            <m:d>
+              <m:dPr>
+                <m:ctrlPr>
+                  <w:rPr>
+                    <w:rFonts w:ascii="Cambria Math" w:eastAsiaTheme="minorEastAsia" w:hAnsi="Cambria Math"/>
+                    <w:i/>
+                    <w:sz w:val="28"/>
+                    <w:szCs w:val="28"/>
+                    <w:lang w:val="en-US"/>
+                  </w:rPr>
+                </m:ctrlPr>
+              </m:dPr>
+              <m:e>
+                <m:r>
+                  <w:rPr>
+                    <w:rFonts w:ascii="Cambria Math" w:eastAsiaTheme="minorEastAsia" w:hAnsi="Cambria Math"/>
+                    <w:sz w:val="28"/>
+                    <w:szCs w:val="28"/>
+                  </w:rPr>
+                  <m:t>1,2 - 1,0</m:t>
+                </m:r>
+              </m:e>
+            </m:d>
+            <m:r>
+              <w:rPr>
+                <w:rFonts w:ascii="Cambria Math" w:eastAsiaTheme="minorEastAsia" w:hAnsi="Cambria Math"/>
+                <w:sz w:val="28"/>
+                <w:szCs w:val="28"/>
+              </w:rPr>
+              <m:t xml:space="preserve">* </m:t>
+            </m:r>
+            <m:d>
+              <m:dPr>
+                <m:ctrlPr>
+                  <w:rPr>
+                    <w:rFonts w:ascii="Cambria Math" w:eastAsiaTheme="minorEastAsia" w:hAnsi="Cambria Math"/>
+                    <w:i/>
+                    <w:sz w:val="28"/>
+                    <w:szCs w:val="28"/>
+                    <w:lang w:val="en-US"/>
+                  </w:rPr>
+                </m:ctrlPr>
+              </m:dPr>
+              <m:e>
+                <m:r>
+                  <w:rPr>
+                    <w:rFonts w:ascii="Cambria Math" w:eastAsiaTheme="minorEastAsia" w:hAnsi="Cambria Math"/>
+                    <w:sz w:val="28"/>
+                    <w:szCs w:val="28"/>
+                  </w:rPr>
+                  <m:t>1,2 - 1,1</m:t>
+                </m:r>
+              </m:e>
+            </m:d>
+            <m:r>
+              <w:rPr>
+                <w:rFonts w:ascii="Cambria Math" w:eastAsiaTheme="minorEastAsia" w:hAnsi="Cambria Math"/>
+                <w:sz w:val="28"/>
+                <w:szCs w:val="28"/>
+              </w:rPr>
+              <m:t xml:space="preserve">* </m:t>
+            </m:r>
+            <m:d>
+              <m:dPr>
+                <m:ctrlPr>
+                  <w:rPr>
+                    <w:rFonts w:ascii="Cambria Math" w:eastAsiaTheme="minorEastAsia" w:hAnsi="Cambria Math"/>
+                    <w:i/>
+                    <w:sz w:val="28"/>
+                    <w:szCs w:val="28"/>
+                    <w:lang w:val="en-US"/>
+                  </w:rPr>
+                </m:ctrlPr>
+              </m:dPr>
+              <m:e>
+                <m:r>
+                  <w:rPr>
+                    <w:rFonts w:ascii="Cambria Math" w:eastAsiaTheme="minorEastAsia" w:hAnsi="Cambria Math"/>
+                    <w:sz w:val="28"/>
+                    <w:szCs w:val="28"/>
+                  </w:rPr>
+                  <m:t>1,2 - 1,3</m:t>
+                </m:r>
+              </m:e>
+            </m:d>
+          </m:den>
+        </m:f>
+        <m:r>
+          <w:rPr>
+            <w:rFonts w:ascii="Cambria Math" w:eastAsiaTheme="minorEastAsia" w:hAnsi="Cambria Math"/>
+            <w:sz w:val="28"/>
+            <w:szCs w:val="28"/>
+          </w:rPr>
+          <m:t xml:space="preserve">- </m:t>
+        </m:r>
+        <m:r>
+          <m:rPr>
+            <m:sty m:val="p"/>
+          </m:rPr>
+          <w:rPr>
+            <w:rFonts w:ascii="Cambria Math" w:hAnsi="Cambria Math"/>
+            <w:sz w:val="28"/>
+            <w:szCs w:val="28"/>
+          </w:rPr>
+          <m:t>0,8569</m:t>
+        </m:r>
+        <m:r>
+          <w:rPr>
+            <w:rFonts w:ascii="Cambria Math" w:eastAsiaTheme="minorEastAsia" w:hAnsi="Cambria Math"/>
+            <w:sz w:val="28"/>
+            <w:szCs w:val="28"/>
+          </w:rPr>
+          <m:t xml:space="preserve">* </m:t>
+        </m:r>
+        <m:f>
+          <m:fPr>
+            <m:ctrlPr>
+              <w:rPr>
+                <w:rFonts w:ascii="Cambria Math" w:eastAsiaTheme="minorEastAsia" w:hAnsi="Cambria Math"/>
+                <w:i/>
+                <w:sz w:val="28"/>
+                <w:szCs w:val="28"/>
+                <w:lang w:val="en-US"/>
+              </w:rPr>
+            </m:ctrlPr>
+          </m:fPr>
+          <m:num>
+            <m:r>
+              <w:rPr>
+                <w:rFonts w:ascii="Cambria Math" w:eastAsiaTheme="minorEastAsia" w:hAnsi="Cambria Math"/>
+                <w:sz w:val="28"/>
+                <w:szCs w:val="28"/>
+              </w:rPr>
+              <m:t>(</m:t>
+            </m:r>
+            <m:r>
+              <w:rPr>
+                <w:rFonts w:ascii="Cambria Math" w:eastAsiaTheme="minorEastAsia" w:hAnsi="Cambria Math"/>
+                <w:sz w:val="28"/>
+                <w:szCs w:val="28"/>
+                <w:lang w:val="en-US"/>
+              </w:rPr>
+              <m:t>x</m:t>
+            </m:r>
+            <m:r>
+              <w:rPr>
+                <w:rFonts w:ascii="Cambria Math" w:eastAsiaTheme="minorEastAsia" w:hAnsi="Cambria Math"/>
+                <w:sz w:val="28"/>
+                <w:szCs w:val="28"/>
+              </w:rPr>
+              <m:t xml:space="preserve"> - 1,0) * (</m:t>
+            </m:r>
+            <m:r>
+              <w:rPr>
+                <w:rFonts w:ascii="Cambria Math" w:eastAsiaTheme="minorEastAsia" w:hAnsi="Cambria Math"/>
+                <w:sz w:val="28"/>
+                <w:szCs w:val="28"/>
+                <w:lang w:val="en-US"/>
+              </w:rPr>
+              <m:t>x</m:t>
+            </m:r>
+            <m:r>
+              <w:rPr>
+                <w:rFonts w:ascii="Cambria Math" w:eastAsiaTheme="minorEastAsia" w:hAnsi="Cambria Math"/>
+                <w:sz w:val="28"/>
+                <w:szCs w:val="28"/>
+              </w:rPr>
+              <m:t xml:space="preserve"> - 1,1) * (</m:t>
+            </m:r>
+            <m:r>
+              <w:rPr>
+                <w:rFonts w:ascii="Cambria Math" w:eastAsiaTheme="minorEastAsia" w:hAnsi="Cambria Math"/>
+                <w:sz w:val="28"/>
+                <w:szCs w:val="28"/>
+                <w:lang w:val="en-US"/>
+              </w:rPr>
+              <m:t>x</m:t>
+            </m:r>
+            <m:r>
+              <w:rPr>
+                <w:rFonts w:ascii="Cambria Math" w:eastAsiaTheme="minorEastAsia" w:hAnsi="Cambria Math"/>
+                <w:sz w:val="28"/>
+                <w:szCs w:val="28"/>
+              </w:rPr>
+              <m:t xml:space="preserve"> - 1,2)</m:t>
+            </m:r>
+          </m:num>
+          <m:den>
+            <m:r>
+              <w:rPr>
+                <w:rFonts w:ascii="Cambria Math" w:eastAsiaTheme="minorEastAsia" w:hAnsi="Cambria Math"/>
+                <w:sz w:val="28"/>
+                <w:szCs w:val="28"/>
+              </w:rPr>
+              <m:t>(1,3 - 1,0) * (1,3 - 1,1) * (1,3 - 1,2)</m:t>
+            </m:r>
+          </m:den>
+        </m:f>
+      </m:oMath>
     </w:p>
     <w:p>
       <w:pPr>
-        <w:spacing w:after="200" w:line="276" w:lineRule="auto"/>
+        <w:spacing w:line="360" w:lineRule="auto"/>
+        <w:jc w:val="both"/>
         <w:rPr>
           <w:sz w:val="26"/>
           <w:szCs w:val="26"/>
@@ -3840,6 +4963,7 @@
     </w:p>
     <w:p>
       <w:pPr>
+        <w:spacing w:line="360" w:lineRule="auto"/>
         <w:jc w:val="both"/>
         <w:rPr>
           <w:sz w:val="26"/>
@@ -3848,12 +4972,467 @@
       </w:pPr>
       <w:r>
         <w:rPr>
+          <w:sz w:val="26"/>
+          <w:szCs w:val="26"/>
+        </w:rPr>
+        <w:lastRenderedPageBreak/>
+        <w:t xml:space="preserve">Интерполированное значение: </w:t>
+      </w:r>
+    </w:p>
+    <w:p>
+      <w:pPr>
+        <w:spacing w:line="360" w:lineRule="auto"/>
+        <w:jc w:val="both"/>
+        <w:rPr>
+          <w:sz w:val="26"/>
+          <w:szCs w:val="26"/>
+        </w:rPr>
+      </w:pPr>
+      <w:r>
+        <w:rPr>
+          <w:sz w:val="26"/>
+          <w:szCs w:val="26"/>
+        </w:rPr>
+        <w:tab/>
+      </w:r>
+      <w:r>
+        <w:rPr>
+          <w:sz w:val="26"/>
+          <w:szCs w:val="26"/>
+        </w:rPr>
+        <w:t>-0.70978</w:t>
+      </w:r>
+    </w:p>
+    <w:p>
+      <w:pPr>
+        <w:spacing w:line="360" w:lineRule="auto"/>
+        <w:rPr>
+          <w:sz w:val="26"/>
+          <w:szCs w:val="26"/>
+        </w:rPr>
+      </w:pPr>
+      <w:r>
+        <w:rPr>
+          <w:sz w:val="26"/>
+          <w:szCs w:val="26"/>
+        </w:rPr>
+        <w:t>Точное значение:</w:t>
+      </w:r>
+      <w:r>
+        <w:rPr>
+          <w:sz w:val="26"/>
+          <w:szCs w:val="26"/>
+        </w:rPr>
+        <w:br/>
+      </w:r>
+      <w:r>
+        <w:rPr>
+          <w:sz w:val="26"/>
+          <w:szCs w:val="26"/>
+        </w:rPr>
+        <w:tab/>
+      </w:r>
+      <w:r>
+        <w:rPr>
+          <w:sz w:val="26"/>
+          <w:szCs w:val="26"/>
+        </w:rPr>
+        <w:t>-0.70979</w:t>
+      </w:r>
+    </w:p>
+    <w:p>
+      <w:pPr>
+        <w:spacing w:line="360" w:lineRule="auto"/>
+        <w:rPr>
+          <w:sz w:val="26"/>
+          <w:szCs w:val="26"/>
+        </w:rPr>
+      </w:pPr>
+      <w:r>
+        <w:rPr>
+          <w:sz w:val="26"/>
+          <w:szCs w:val="26"/>
+        </w:rPr>
+        <w:t>Ошибка метода:</w:t>
+      </w:r>
+    </w:p>
+    <w:p>
+      <w:pPr>
+        <w:spacing w:line="360" w:lineRule="auto"/>
+        <w:rPr>
+          <w:sz w:val="26"/>
+          <w:szCs w:val="26"/>
+        </w:rPr>
+      </w:pPr>
+      <w:r>
+        <w:rPr>
+          <w:sz w:val="26"/>
+          <w:szCs w:val="26"/>
+        </w:rPr>
+        <w:tab/>
+      </w:r>
+      <w:r>
+        <w:rPr>
+          <w:sz w:val="26"/>
+          <w:szCs w:val="26"/>
+        </w:rPr>
+        <w:t>0.00001</w:t>
+      </w:r>
+    </w:p>
+    <w:p>
+      <w:pPr>
+        <w:spacing w:line="360" w:lineRule="auto"/>
+        <w:rPr>
+          <w:sz w:val="26"/>
+          <w:szCs w:val="26"/>
+        </w:rPr>
+      </w:pPr>
+      <w:r>
+        <w:rPr>
+          <w:sz w:val="26"/>
+          <w:szCs w:val="26"/>
+        </w:rPr>
+        <w:t>Ошибка вычисления:</w:t>
+      </w:r>
+      <w:r>
+        <w:rPr>
+          <w:sz w:val="26"/>
+          <w:szCs w:val="26"/>
+        </w:rPr>
+        <w:br/>
+      </w:r>
+      <w:r>
+        <w:rPr>
+          <w:sz w:val="26"/>
+          <w:szCs w:val="26"/>
+        </w:rPr>
+        <w:tab/>
+      </w:r>
+      <w:r>
+        <w:rPr>
+          <w:sz w:val="26"/>
+          <w:szCs w:val="26"/>
+        </w:rPr>
+        <w:t>0.00002</w:t>
+      </w:r>
+    </w:p>
+    <w:p>
+      <w:pPr>
+        <w:spacing w:after="160" w:line="259" w:lineRule="auto"/>
+        <w:rPr>
+          <w:sz w:val="26"/>
+          <w:szCs w:val="26"/>
+        </w:rPr>
+      </w:pPr>
+      <w:r>
+        <w:rPr>
+          <w:sz w:val="26"/>
+          <w:szCs w:val="26"/>
+        </w:rPr>
+        <w:br w:type="page"/>
+      </w:r>
+    </w:p>
+    <w:p>
+      <w:pPr>
+        <w:spacing w:line="360" w:lineRule="auto"/>
+        <w:jc w:val="both"/>
+        <w:rPr>
+          <w:sz w:val="26"/>
+          <w:szCs w:val="26"/>
+        </w:rPr>
+      </w:pPr>
+    </w:p>
+    <w:p>
+      <w:pPr>
+        <w:jc w:val="both"/>
+        <w:rPr>
+          <w:b/>
+          <w:sz w:val="26"/>
+          <w:szCs w:val="26"/>
+        </w:rPr>
+      </w:pPr>
+      <w:r>
+        <w:rPr>
+          <w:b/>
+          <w:sz w:val="26"/>
+          <w:szCs w:val="26"/>
+        </w:rPr>
+        <w:t>Задани</w:t>
+      </w:r>
+      <w:r>
+        <w:rPr>
+          <w:b/>
+          <w:sz w:val="26"/>
+          <w:szCs w:val="26"/>
+        </w:rPr>
+        <w:t>е 2.</w:t>
+      </w:r>
+      <w:r>
+        <w:rPr>
+          <w:b/>
+          <w:sz w:val="26"/>
+          <w:szCs w:val="26"/>
+        </w:rPr>
+        <w:t xml:space="preserve"> </w:t>
+      </w:r>
+      <w:r>
+        <w:rPr>
+          <w:b/>
+          <w:sz w:val="26"/>
+          <w:szCs w:val="26"/>
+        </w:rPr>
+        <w:t>Дифференцирование</w:t>
+      </w:r>
+    </w:p>
+    <w:p>
+      <w:pPr>
+        <w:jc w:val="both"/>
+        <w:rPr>
+          <w:b/>
+          <w:sz w:val="26"/>
+          <w:szCs w:val="26"/>
+        </w:rPr>
+      </w:pPr>
+    </w:p>
+    <w:p>
+      <w:pPr>
+        <w:spacing w:line="360" w:lineRule="auto"/>
+        <w:jc w:val="both"/>
+        <w:rPr>
+          <w:sz w:val="26"/>
+          <w:szCs w:val="26"/>
+        </w:rPr>
+      </w:pPr>
+      <w:r>
+        <w:rPr>
+          <w:sz w:val="26"/>
+          <w:szCs w:val="26"/>
+        </w:rPr>
+        <w:t xml:space="preserve">2) </w:t>
+      </w:r>
+      <w:r>
+        <w:rPr>
+          <w:sz w:val="26"/>
+          <w:szCs w:val="26"/>
+        </w:rPr>
+        <w:t>Вычислить таблицу на</w:t>
+      </w:r>
+      <w:r>
+        <w:rPr>
+          <w:sz w:val="26"/>
+          <w:szCs w:val="26"/>
+        </w:rPr>
+        <w:t xml:space="preserve"> отрезке </w:t>
+      </w:r>
+      <w:r>
+        <w:rPr>
+          <w:sz w:val="26"/>
+          <w:szCs w:val="26"/>
+        </w:rPr>
+        <w:t>[</w:t>
+      </w:r>
+      <w:r>
+        <w:rPr>
+          <w:sz w:val="26"/>
+          <w:szCs w:val="26"/>
+          <w:lang w:val="en-US"/>
+        </w:rPr>
+        <w:t>a</w:t>
+      </w:r>
+      <w:r>
+        <w:rPr>
+          <w:sz w:val="26"/>
+          <w:szCs w:val="26"/>
+        </w:rPr>
+        <w:t>,</w:t>
+      </w:r>
+      <w:r>
+        <w:rPr>
+          <w:sz w:val="26"/>
+          <w:szCs w:val="26"/>
+          <w:lang w:val="en-US"/>
+        </w:rPr>
+        <w:t>b</w:t>
+      </w:r>
+      <w:r>
+        <w:rPr>
+          <w:sz w:val="26"/>
+          <w:szCs w:val="26"/>
+        </w:rPr>
+        <w:t xml:space="preserve">] </w:t>
+      </w:r>
+      <w:r>
+        <w:rPr>
+          <w:sz w:val="26"/>
+          <w:szCs w:val="26"/>
+        </w:rPr>
+        <w:t xml:space="preserve">на </w:t>
+      </w:r>
+      <w:r>
+        <w:rPr>
+          <w:sz w:val="26"/>
+          <w:szCs w:val="26"/>
+        </w:rPr>
+        <w:t>равномерной сетке (</w:t>
+      </w:r>
+      <w:r>
+        <w:rPr>
+          <w:sz w:val="26"/>
+          <w:szCs w:val="26"/>
+        </w:rPr>
+        <w:t>5</w:t>
+      </w:r>
+      <w:r>
+        <w:rPr>
+          <w:sz w:val="26"/>
+          <w:szCs w:val="26"/>
+        </w:rPr>
+        <w:t xml:space="preserve"> узлов), </w:t>
+      </w:r>
+      <w:r>
+        <w:rPr>
+          <w:sz w:val="26"/>
+          <w:szCs w:val="26"/>
+        </w:rPr>
+        <w:t xml:space="preserve">и в этих узлах </w:t>
+      </w:r>
+      <w:r>
+        <w:rPr>
+          <w:sz w:val="26"/>
+          <w:szCs w:val="26"/>
+        </w:rPr>
+        <w:t xml:space="preserve">найти значение первой производной функции по формулам 1-го </w:t>
+      </w:r>
+      <w:r>
+        <w:rPr>
+          <w:sz w:val="26"/>
+          <w:szCs w:val="26"/>
+        </w:rPr>
+        <w:t xml:space="preserve">(левая и правая) </w:t>
+      </w:r>
+      <w:r>
+        <w:rPr>
+          <w:sz w:val="26"/>
+          <w:szCs w:val="26"/>
+        </w:rPr>
+        <w:t>и 2-го порядка точности</w:t>
+      </w:r>
+      <w:r>
+        <w:rPr>
+          <w:sz w:val="26"/>
+          <w:szCs w:val="26"/>
+        </w:rPr>
+        <w:t xml:space="preserve"> (центральная)</w:t>
+      </w:r>
+      <w:r>
+        <w:rPr>
+          <w:sz w:val="26"/>
+          <w:szCs w:val="26"/>
+        </w:rPr>
+        <w:t xml:space="preserve"> и </w:t>
+      </w:r>
+      <w:r>
+        <w:rPr>
+          <w:sz w:val="26"/>
+          <w:szCs w:val="26"/>
+        </w:rPr>
+        <w:t xml:space="preserve">значение </w:t>
+      </w:r>
+      <w:r>
+        <w:rPr>
+          <w:sz w:val="26"/>
+          <w:szCs w:val="26"/>
+        </w:rPr>
+        <w:t>втор</w:t>
+      </w:r>
+      <w:r>
+        <w:rPr>
+          <w:sz w:val="26"/>
+          <w:szCs w:val="26"/>
+        </w:rPr>
+        <w:t>ой</w:t>
+      </w:r>
+      <w:r>
+        <w:rPr>
+          <w:sz w:val="26"/>
+          <w:szCs w:val="26"/>
+        </w:rPr>
+        <w:t xml:space="preserve"> производн</w:t>
+      </w:r>
+      <w:r>
+        <w:rPr>
+          <w:sz w:val="26"/>
+          <w:szCs w:val="26"/>
+        </w:rPr>
+        <w:t>ой</w:t>
+      </w:r>
+      <w:r>
+        <w:rPr>
+          <w:sz w:val="26"/>
+          <w:szCs w:val="26"/>
+        </w:rPr>
+        <w:t xml:space="preserve"> по формулам 2-го порядка точности</w:t>
+      </w:r>
+      <w:r>
+        <w:rPr>
+          <w:sz w:val="26"/>
+          <w:szCs w:val="26"/>
+        </w:rPr>
+        <w:t>,</w:t>
+      </w:r>
+      <w:r>
+        <w:rPr>
+          <w:sz w:val="26"/>
+          <w:szCs w:val="26"/>
+        </w:rPr>
+        <w:t xml:space="preserve"> </w:t>
+      </w:r>
+      <w:r>
+        <w:rPr>
+          <w:sz w:val="26"/>
+          <w:szCs w:val="26"/>
+        </w:rPr>
+        <w:t xml:space="preserve">где это возможно Во всех точках найти точные значения производных. </w:t>
+      </w:r>
+      <w:r>
+        <w:rPr>
+          <w:sz w:val="26"/>
+          <w:szCs w:val="26"/>
+        </w:rPr>
+        <w:t>Оценить погрешность.</w:t>
+      </w:r>
+      <w:r>
+        <w:rPr>
+          <w:sz w:val="26"/>
+          <w:szCs w:val="26"/>
+        </w:rPr>
+        <w:t xml:space="preserve"> Результаты свести в таблицу. Точность – 4 значащих цифры. </w:t>
+      </w:r>
+    </w:p>
+    <w:p>
+      <w:pPr>
+        <w:spacing w:after="200" w:line="276" w:lineRule="auto"/>
+        <w:rPr>
+          <w:sz w:val="26"/>
+          <w:szCs w:val="26"/>
+        </w:rPr>
+      </w:pPr>
+    </w:p>
+    <w:p>
+      <w:pPr>
+        <w:jc w:val="both"/>
+        <w:rPr>
+          <w:sz w:val="26"/>
+          <w:szCs w:val="26"/>
+        </w:rPr>
+      </w:pPr>
+      <w:r>
+        <w:rPr>
           <w:i/>
           <w:sz w:val="26"/>
           <w:szCs w:val="26"/>
           <w:lang w:val="en-US"/>
         </w:rPr>
-        <w:lastRenderedPageBreak/>
         <w:t>f</w:t>
       </w:r>
       <w:r>
@@ -4032,13 +5611,13 @@
         <w:tblLook w:val="04A0" w:firstRow="1" w:lastRow="0" w:firstColumn="1" w:lastColumn="0" w:noHBand="0" w:noVBand="1"/>
       </w:tblPr>
       <w:tblGrid>
-        <w:gridCol w:w="796"/>
+        <w:gridCol w:w="931"/>
         <w:gridCol w:w="1155"/>
         <w:gridCol w:w="1239"/>
         <w:gridCol w:w="1167"/>
-        <w:gridCol w:w="750"/>
-        <w:gridCol w:w="718"/>
-        <w:gridCol w:w="750"/>
+        <w:gridCol w:w="931"/>
+        <w:gridCol w:w="931"/>
+        <w:gridCol w:w="931"/>
       </w:tblGrid>
       <w:tr>
         <w:tc>
@@ -4055,7 +5634,6 @@
                 <w:iCs/>
                 <w:sz w:val="26"/>
                 <w:szCs w:val="26"/>
-                <w:lang w:val="en-US"/>
               </w:rPr>
             </w:pPr>
           </w:p>
@@ -4358,12 +5936,19 @@
           <w:p>
             <w:pPr>
               <w:spacing w:line="360" w:lineRule="auto"/>
-              <w:jc w:val="both"/>
+              <w:jc w:val="center"/>
               <w:rPr>
                 <w:sz w:val="26"/>
                 <w:szCs w:val="26"/>
               </w:rPr>
             </w:pPr>
+            <w:r>
+              <w:rPr>
+                <w:sz w:val="26"/>
+                <w:szCs w:val="26"/>
+              </w:rPr>
+              <w:t>0.0000</w:t>
+            </w:r>
           </w:p>
         </w:tc>
         <w:tc>
@@ -4374,12 +5959,19 @@
           <w:p>
             <w:pPr>
               <w:spacing w:line="360" w:lineRule="auto"/>
-              <w:jc w:val="both"/>
+              <w:jc w:val="center"/>
               <w:rPr>
                 <w:sz w:val="26"/>
                 <w:szCs w:val="26"/>
               </w:rPr>
             </w:pPr>
+            <w:r>
+              <w:rPr>
+                <w:sz w:val="26"/>
+                <w:szCs w:val="26"/>
+              </w:rPr>
+              <w:t>-</w:t>
+            </w:r>
           </w:p>
         </w:tc>
         <w:tc>
@@ -4390,12 +5982,19 @@
           <w:p>
             <w:pPr>
               <w:spacing w:line="360" w:lineRule="auto"/>
-              <w:jc w:val="both"/>
+              <w:jc w:val="center"/>
               <w:rPr>
                 <w:sz w:val="26"/>
                 <w:szCs w:val="26"/>
               </w:rPr>
             </w:pPr>
+            <w:r>
+              <w:rPr>
+                <w:sz w:val="26"/>
+                <w:szCs w:val="26"/>
+              </w:rPr>
+              <w:t>-0.9194</w:t>
+            </w:r>
           </w:p>
         </w:tc>
         <w:tc>
@@ -4406,12 +6005,19 @@
           <w:p>
             <w:pPr>
               <w:spacing w:line="360" w:lineRule="auto"/>
-              <w:jc w:val="both"/>
+              <w:jc w:val="center"/>
               <w:rPr>
                 <w:sz w:val="26"/>
                 <w:szCs w:val="26"/>
               </w:rPr>
             </w:pPr>
+            <w:r>
+              <w:rPr>
+                <w:sz w:val="26"/>
+                <w:szCs w:val="26"/>
+              </w:rPr>
+              <w:t>-</w:t>
+            </w:r>
           </w:p>
         </w:tc>
         <w:tc>
@@ -4422,12 +6028,19 @@
           <w:p>
             <w:pPr>
               <w:spacing w:line="360" w:lineRule="auto"/>
-              <w:jc w:val="both"/>
+              <w:jc w:val="center"/>
               <w:rPr>
                 <w:sz w:val="26"/>
                 <w:szCs w:val="26"/>
               </w:rPr>
             </w:pPr>
+            <w:r>
+              <w:rPr>
+                <w:sz w:val="26"/>
+                <w:szCs w:val="26"/>
+              </w:rPr>
+              <w:t>-</w:t>
+            </w:r>
           </w:p>
         </w:tc>
         <w:tc>
@@ -4438,12 +6051,33 @@
           <w:p>
             <w:pPr>
               <w:spacing w:line="360" w:lineRule="auto"/>
-              <w:jc w:val="both"/>
+              <w:jc w:val="center"/>
               <w:rPr>
                 <w:sz w:val="26"/>
                 <w:szCs w:val="26"/>
               </w:rPr>
             </w:pPr>
+            <w:r>
+              <w:rPr>
+                <w:sz w:val="26"/>
+                <w:szCs w:val="26"/>
+              </w:rPr>
+              <w:t>-</w:t>
+            </w:r>
+            <w:r>
+              <w:rPr>
+                <w:sz w:val="26"/>
+                <w:szCs w:val="26"/>
+              </w:rPr>
+              <w:t>0</w:t>
+            </w:r>
+            <w:r>
+              <w:rPr>
+                <w:sz w:val="26"/>
+                <w:szCs w:val="26"/>
+              </w:rPr>
+              <w:t>.0000</w:t>
+            </w:r>
           </w:p>
         </w:tc>
         <w:tc>
@@ -4454,12 +6088,674 @@
           <w:p>
             <w:pPr>
               <w:spacing w:line="360" w:lineRule="auto"/>
-              <w:jc w:val="both"/>
+              <w:jc w:val="center"/>
               <w:rPr>
                 <w:sz w:val="26"/>
                 <w:szCs w:val="26"/>
               </w:rPr>
             </w:pPr>
+            <w:r>
+              <w:rPr>
+                <w:sz w:val="26"/>
+                <w:szCs w:val="26"/>
+              </w:rPr>
+              <w:t>-8.0000</w:t>
+            </w:r>
+          </w:p>
+        </w:tc>
+      </w:tr>
+      <w:tr>
+        <w:tc>
+          <w:tcPr>
+            <w:tcW w:w="796" w:type="dxa"/>
+            <w:shd w:val="clear" w:color="auto" w:fill="auto"/>
+          </w:tcPr>
+          <w:p>
+            <w:pPr>
+              <w:spacing w:line="360" w:lineRule="auto"/>
+              <w:jc w:val="center"/>
+              <w:rPr>
+                <w:sz w:val="26"/>
+                <w:szCs w:val="26"/>
+              </w:rPr>
+            </w:pPr>
+            <w:r>
+              <w:rPr>
+                <w:sz w:val="26"/>
+                <w:szCs w:val="26"/>
+              </w:rPr>
+              <w:t>0.2500</w:t>
+            </w:r>
+          </w:p>
+        </w:tc>
+        <w:tc>
+          <w:tcPr>
+            <w:tcW w:w="1155" w:type="dxa"/>
+            <w:shd w:val="clear" w:color="auto" w:fill="auto"/>
+          </w:tcPr>
+          <w:p>
+            <w:pPr>
+              <w:spacing w:line="360" w:lineRule="auto"/>
+              <w:jc w:val="center"/>
+              <w:rPr>
+                <w:sz w:val="26"/>
+                <w:szCs w:val="26"/>
+              </w:rPr>
+            </w:pPr>
+            <w:r>
+              <w:rPr>
+                <w:sz w:val="26"/>
+                <w:szCs w:val="26"/>
+              </w:rPr>
+              <w:t>-0.9194</w:t>
+            </w:r>
+          </w:p>
+        </w:tc>
+        <w:tc>
+          <w:tcPr>
+            <w:tcW w:w="1239" w:type="dxa"/>
+            <w:shd w:val="clear" w:color="auto" w:fill="auto"/>
+          </w:tcPr>
+          <w:p>
+            <w:pPr>
+              <w:spacing w:line="360" w:lineRule="auto"/>
+              <w:jc w:val="center"/>
+              <w:rPr>
+                <w:sz w:val="26"/>
+                <w:szCs w:val="26"/>
+              </w:rPr>
+            </w:pPr>
+            <w:r>
+              <w:rPr>
+                <w:sz w:val="26"/>
+                <w:szCs w:val="26"/>
+              </w:rPr>
+              <w:t>-1.9129</w:t>
+            </w:r>
+          </w:p>
+        </w:tc>
+        <w:tc>
+          <w:tcPr>
+            <w:tcW w:w="1167" w:type="dxa"/>
+            <w:shd w:val="clear" w:color="auto" w:fill="auto"/>
+          </w:tcPr>
+          <w:p>
+            <w:pPr>
+              <w:spacing w:line="360" w:lineRule="auto"/>
+              <w:jc w:val="center"/>
+              <w:rPr>
+                <w:sz w:val="26"/>
+                <w:szCs w:val="26"/>
+              </w:rPr>
+            </w:pPr>
+            <w:r>
+              <w:rPr>
+                <w:sz w:val="26"/>
+                <w:szCs w:val="26"/>
+              </w:rPr>
+              <w:t>-1.4161</w:t>
+            </w:r>
+          </w:p>
+        </w:tc>
+        <w:tc>
+          <w:tcPr>
+            <w:tcW w:w="750" w:type="dxa"/>
+            <w:shd w:val="clear" w:color="auto" w:fill="auto"/>
+          </w:tcPr>
+          <w:p>
+            <w:pPr>
+              <w:spacing w:line="360" w:lineRule="auto"/>
+              <w:jc w:val="center"/>
+              <w:rPr>
+                <w:sz w:val="26"/>
+                <w:szCs w:val="26"/>
+              </w:rPr>
+            </w:pPr>
+            <w:r>
+              <w:rPr>
+                <w:sz w:val="26"/>
+                <w:szCs w:val="26"/>
+              </w:rPr>
+              <w:t>-3.9740</w:t>
+            </w:r>
+          </w:p>
+        </w:tc>
+        <w:tc>
+          <w:tcPr>
+            <w:tcW w:w="718" w:type="dxa"/>
+            <w:shd w:val="clear" w:color="auto" w:fill="auto"/>
+          </w:tcPr>
+          <w:p>
+            <w:pPr>
+              <w:spacing w:line="360" w:lineRule="auto"/>
+              <w:jc w:val="center"/>
+              <w:rPr>
+                <w:sz w:val="26"/>
+                <w:szCs w:val="26"/>
+              </w:rPr>
+            </w:pPr>
+            <w:r>
+              <w:rPr>
+                <w:sz w:val="26"/>
+                <w:szCs w:val="26"/>
+              </w:rPr>
+              <w:t>-1.6829</w:t>
+            </w:r>
+          </w:p>
+        </w:tc>
+        <w:tc>
+          <w:tcPr>
+            <w:tcW w:w="750" w:type="dxa"/>
+            <w:shd w:val="clear" w:color="auto" w:fill="auto"/>
+          </w:tcPr>
+          <w:p>
+            <w:pPr>
+              <w:spacing w:line="360" w:lineRule="auto"/>
+              <w:jc w:val="center"/>
+              <w:rPr>
+                <w:sz w:val="26"/>
+                <w:szCs w:val="26"/>
+              </w:rPr>
+            </w:pPr>
+            <w:r>
+              <w:rPr>
+                <w:sz w:val="26"/>
+                <w:szCs w:val="26"/>
+              </w:rPr>
+              <w:t>-4.3224</w:t>
+            </w:r>
+          </w:p>
+        </w:tc>
+      </w:tr>
+      <w:tr>
+        <w:tc>
+          <w:tcPr>
+            <w:tcW w:w="796" w:type="dxa"/>
+            <w:shd w:val="clear" w:color="auto" w:fill="auto"/>
+          </w:tcPr>
+          <w:p>
+            <w:pPr>
+              <w:spacing w:line="360" w:lineRule="auto"/>
+              <w:jc w:val="center"/>
+              <w:rPr>
+                <w:sz w:val="26"/>
+                <w:szCs w:val="26"/>
+              </w:rPr>
+            </w:pPr>
+            <w:r>
+              <w:rPr>
+                <w:sz w:val="26"/>
+                <w:szCs w:val="26"/>
+              </w:rPr>
+              <w:t>0.5000</w:t>
+            </w:r>
+          </w:p>
+        </w:tc>
+        <w:tc>
+          <w:tcPr>
+            <w:tcW w:w="1155" w:type="dxa"/>
+            <w:shd w:val="clear" w:color="auto" w:fill="auto"/>
+          </w:tcPr>
+          <w:p>
+            <w:pPr>
+              <w:spacing w:line="360" w:lineRule="auto"/>
+              <w:jc w:val="center"/>
+              <w:rPr>
+                <w:sz w:val="26"/>
+                <w:szCs w:val="26"/>
+              </w:rPr>
+            </w:pPr>
+            <w:r>
+              <w:rPr>
+                <w:sz w:val="26"/>
+                <w:szCs w:val="26"/>
+              </w:rPr>
+              <w:t>-1.9129</w:t>
+            </w:r>
+          </w:p>
+        </w:tc>
+        <w:tc>
+          <w:tcPr>
+            <w:tcW w:w="1239" w:type="dxa"/>
+            <w:shd w:val="clear" w:color="auto" w:fill="auto"/>
+          </w:tcPr>
+          <w:p>
+            <w:pPr>
+              <w:spacing w:line="360" w:lineRule="auto"/>
+              <w:jc w:val="center"/>
+              <w:rPr>
+                <w:sz w:val="26"/>
+                <w:szCs w:val="26"/>
+              </w:rPr>
+            </w:pPr>
+            <w:r>
+              <w:rPr>
+                <w:sz w:val="26"/>
+                <w:szCs w:val="26"/>
+              </w:rPr>
+              <w:t>-1.1477</w:t>
+            </w:r>
+          </w:p>
+        </w:tc>
+        <w:tc>
+          <w:tcPr>
+            <w:tcW w:w="1167" w:type="dxa"/>
+            <w:shd w:val="clear" w:color="auto" w:fill="auto"/>
+          </w:tcPr>
+          <w:p>
+            <w:pPr>
+              <w:spacing w:line="360" w:lineRule="auto"/>
+              <w:jc w:val="center"/>
+              <w:rPr>
+                <w:sz w:val="26"/>
+                <w:szCs w:val="26"/>
+              </w:rPr>
+            </w:pPr>
+            <w:r>
+              <w:rPr>
+                <w:sz w:val="26"/>
+                <w:szCs w:val="26"/>
+              </w:rPr>
+              <w:t>-1.5303</w:t>
+            </w:r>
+          </w:p>
+        </w:tc>
+        <w:tc>
+          <w:tcPr>
+            <w:tcW w:w="750" w:type="dxa"/>
+            <w:shd w:val="clear" w:color="auto" w:fill="auto"/>
+          </w:tcPr>
+          <w:p>
+            <w:pPr>
+              <w:spacing w:line="360" w:lineRule="auto"/>
+              <w:jc w:val="center"/>
+              <w:rPr>
+                <w:sz w:val="26"/>
+                <w:szCs w:val="26"/>
+              </w:rPr>
+            </w:pPr>
+            <w:r>
+              <w:rPr>
+                <w:sz w:val="26"/>
+                <w:szCs w:val="26"/>
+              </w:rPr>
+              <w:t>3.0608</w:t>
+            </w:r>
+          </w:p>
+        </w:tc>
+        <w:tc>
+          <w:tcPr>
+            <w:tcW w:w="718" w:type="dxa"/>
+            <w:shd w:val="clear" w:color="auto" w:fill="auto"/>
+          </w:tcPr>
+          <w:p>
+            <w:pPr>
+              <w:spacing w:line="360" w:lineRule="auto"/>
+              <w:jc w:val="center"/>
+              <w:rPr>
+                <w:sz w:val="26"/>
+                <w:szCs w:val="26"/>
+              </w:rPr>
+            </w:pPr>
+            <w:r>
+              <w:rPr>
+                <w:sz w:val="26"/>
+                <w:szCs w:val="26"/>
+              </w:rPr>
+              <w:t>-1.8186</w:t>
+            </w:r>
+          </w:p>
+        </w:tc>
+        <w:tc>
+          <w:tcPr>
+            <w:tcW w:w="750" w:type="dxa"/>
+            <w:shd w:val="clear" w:color="auto" w:fill="auto"/>
+          </w:tcPr>
+          <w:p>
+            <w:pPr>
+              <w:spacing w:line="360" w:lineRule="auto"/>
+              <w:jc w:val="center"/>
+              <w:rPr>
+                <w:sz w:val="26"/>
+                <w:szCs w:val="26"/>
+              </w:rPr>
+            </w:pPr>
+            <w:r>
+              <w:rPr>
+                <w:sz w:val="26"/>
+                <w:szCs w:val="26"/>
+              </w:rPr>
+              <w:t>3.3292</w:t>
+            </w:r>
+          </w:p>
+        </w:tc>
+      </w:tr>
+      <w:tr>
+        <w:tc>
+          <w:tcPr>
+            <w:tcW w:w="796" w:type="dxa"/>
+            <w:shd w:val="clear" w:color="auto" w:fill="auto"/>
+          </w:tcPr>
+          <w:p>
+            <w:pPr>
+              <w:tabs>
+                <w:tab w:val="left" w:pos="470"/>
+              </w:tabs>
+              <w:spacing w:line="360" w:lineRule="auto"/>
+              <w:jc w:val="center"/>
+              <w:rPr>
+                <w:sz w:val="26"/>
+                <w:szCs w:val="26"/>
+              </w:rPr>
+            </w:pPr>
+            <w:r>
+              <w:rPr>
+                <w:sz w:val="26"/>
+                <w:szCs w:val="26"/>
+              </w:rPr>
+              <w:t>0.7500</w:t>
+            </w:r>
+          </w:p>
+        </w:tc>
+        <w:tc>
+          <w:tcPr>
+            <w:tcW w:w="1155" w:type="dxa"/>
+            <w:shd w:val="clear" w:color="auto" w:fill="auto"/>
+          </w:tcPr>
+          <w:p>
+            <w:pPr>
+              <w:spacing w:line="360" w:lineRule="auto"/>
+              <w:jc w:val="center"/>
+              <w:rPr>
+                <w:sz w:val="26"/>
+                <w:szCs w:val="26"/>
+              </w:rPr>
+            </w:pPr>
+            <w:r>
+              <w:rPr>
+                <w:sz w:val="26"/>
+                <w:szCs w:val="26"/>
+              </w:rPr>
+              <w:t>-1.1477</w:t>
+            </w:r>
+          </w:p>
+        </w:tc>
+        <w:tc>
+          <w:tcPr>
+            <w:tcW w:w="1239" w:type="dxa"/>
+            <w:shd w:val="clear" w:color="auto" w:fill="auto"/>
+          </w:tcPr>
+          <w:p>
+            <w:pPr>
+              <w:spacing w:line="360" w:lineRule="auto"/>
+              <w:jc w:val="center"/>
+              <w:rPr>
+                <w:sz w:val="26"/>
+                <w:szCs w:val="26"/>
+              </w:rPr>
+            </w:pPr>
+            <w:r>
+              <w:rPr>
+                <w:sz w:val="26"/>
+                <w:szCs w:val="26"/>
+              </w:rPr>
+              <w:t>0.6727</w:t>
+            </w:r>
+          </w:p>
+        </w:tc>
+        <w:tc>
+          <w:tcPr>
+            <w:tcW w:w="1167" w:type="dxa"/>
+            <w:shd w:val="clear" w:color="auto" w:fill="auto"/>
+          </w:tcPr>
+          <w:p>
+            <w:pPr>
+              <w:spacing w:line="360" w:lineRule="auto"/>
+              <w:jc w:val="center"/>
+              <w:rPr>
+                <w:sz w:val="26"/>
+                <w:szCs w:val="26"/>
+              </w:rPr>
+            </w:pPr>
+            <w:r>
+              <w:rPr>
+                <w:sz w:val="26"/>
+                <w:szCs w:val="26"/>
+              </w:rPr>
+              <w:t>-0.2375</w:t>
+            </w:r>
+          </w:p>
+        </w:tc>
+        <w:tc>
+          <w:tcPr>
+            <w:tcW w:w="750" w:type="dxa"/>
+            <w:shd w:val="clear" w:color="auto" w:fill="auto"/>
+          </w:tcPr>
+          <w:p>
+            <w:pPr>
+              <w:spacing w:line="360" w:lineRule="auto"/>
+              <w:jc w:val="center"/>
+              <w:rPr>
+                <w:sz w:val="26"/>
+                <w:szCs w:val="26"/>
+              </w:rPr>
+            </w:pPr>
+            <w:r>
+              <w:rPr>
+                <w:sz w:val="26"/>
+                <w:szCs w:val="26"/>
+              </w:rPr>
+              <w:t>7.2816</w:t>
+            </w:r>
+          </w:p>
+        </w:tc>
+        <w:tc>
+          <w:tcPr>
+            <w:tcW w:w="718" w:type="dxa"/>
+            <w:shd w:val="clear" w:color="auto" w:fill="auto"/>
+          </w:tcPr>
+          <w:p>
+            <w:pPr>
+              <w:spacing w:line="360" w:lineRule="auto"/>
+              <w:jc w:val="center"/>
+              <w:rPr>
+                <w:sz w:val="26"/>
+                <w:szCs w:val="26"/>
+              </w:rPr>
+            </w:pPr>
+            <w:r>
+              <w:rPr>
+                <w:sz w:val="26"/>
+                <w:szCs w:val="26"/>
+              </w:rPr>
+              <w:t>-0.2822</w:t>
+            </w:r>
+          </w:p>
+        </w:tc>
+        <w:tc>
+          <w:tcPr>
+            <w:tcW w:w="750" w:type="dxa"/>
+            <w:shd w:val="clear" w:color="auto" w:fill="auto"/>
+          </w:tcPr>
+          <w:p>
+            <w:pPr>
+              <w:spacing w:line="360" w:lineRule="auto"/>
+              <w:jc w:val="center"/>
+              <w:rPr>
+                <w:sz w:val="26"/>
+                <w:szCs w:val="26"/>
+              </w:rPr>
+            </w:pPr>
+            <w:r>
+              <w:rPr>
+                <w:sz w:val="26"/>
+                <w:szCs w:val="26"/>
+              </w:rPr>
+              <w:t>7.9199</w:t>
+            </w:r>
+          </w:p>
+        </w:tc>
+      </w:tr>
+      <w:tr>
+        <w:tc>
+          <w:tcPr>
+            <w:tcW w:w="796" w:type="dxa"/>
+            <w:shd w:val="clear" w:color="auto" w:fill="auto"/>
+          </w:tcPr>
+          <w:p>
+            <w:pPr>
+              <w:spacing w:line="360" w:lineRule="auto"/>
+              <w:jc w:val="center"/>
+              <w:rPr>
+                <w:sz w:val="26"/>
+                <w:szCs w:val="26"/>
+              </w:rPr>
+            </w:pPr>
+            <w:r>
+              <w:rPr>
+                <w:sz w:val="26"/>
+                <w:szCs w:val="26"/>
+              </w:rPr>
+              <w:t>1.0000</w:t>
+            </w:r>
+          </w:p>
+        </w:tc>
+        <w:tc>
+          <w:tcPr>
+            <w:tcW w:w="1155" w:type="dxa"/>
+            <w:shd w:val="clear" w:color="auto" w:fill="auto"/>
+          </w:tcPr>
+          <w:p>
+            <w:pPr>
+              <w:spacing w:line="360" w:lineRule="auto"/>
+              <w:jc w:val="center"/>
+              <w:rPr>
+                <w:sz w:val="26"/>
+                <w:szCs w:val="26"/>
+              </w:rPr>
+            </w:pPr>
+            <w:r>
+              <w:rPr>
+                <w:sz w:val="26"/>
+                <w:szCs w:val="26"/>
+              </w:rPr>
+              <w:t>0.6727</w:t>
+            </w:r>
+          </w:p>
+        </w:tc>
+        <w:tc>
+          <w:tcPr>
+            <w:tcW w:w="1239" w:type="dxa"/>
+            <w:shd w:val="clear" w:color="auto" w:fill="auto"/>
+          </w:tcPr>
+          <w:p>
+            <w:pPr>
+              <w:spacing w:line="360" w:lineRule="auto"/>
+              <w:jc w:val="center"/>
+              <w:rPr>
+                <w:sz w:val="26"/>
+                <w:szCs w:val="26"/>
+              </w:rPr>
+            </w:pPr>
+            <w:r>
+              <w:rPr>
+                <w:sz w:val="26"/>
+                <w:szCs w:val="26"/>
+              </w:rPr>
+              <w:t>-</w:t>
+            </w:r>
+          </w:p>
+        </w:tc>
+        <w:tc>
+          <w:tcPr>
+            <w:tcW w:w="1167" w:type="dxa"/>
+            <w:shd w:val="clear" w:color="auto" w:fill="auto"/>
+          </w:tcPr>
+          <w:p>
+            <w:pPr>
+              <w:spacing w:line="360" w:lineRule="auto"/>
+              <w:jc w:val="center"/>
+              <w:rPr>
+                <w:sz w:val="26"/>
+                <w:szCs w:val="26"/>
+              </w:rPr>
+            </w:pPr>
+            <w:r>
+              <w:rPr>
+                <w:sz w:val="26"/>
+                <w:szCs w:val="26"/>
+              </w:rPr>
+              <w:t>-</w:t>
+            </w:r>
+          </w:p>
+        </w:tc>
+        <w:tc>
+          <w:tcPr>
+            <w:tcW w:w="750" w:type="dxa"/>
+            <w:shd w:val="clear" w:color="auto" w:fill="auto"/>
+          </w:tcPr>
+          <w:p>
+            <w:pPr>
+              <w:spacing w:line="360" w:lineRule="auto"/>
+              <w:jc w:val="center"/>
+              <w:rPr>
+                <w:sz w:val="26"/>
+                <w:szCs w:val="26"/>
+              </w:rPr>
+            </w:pPr>
+            <w:r>
+              <w:rPr>
+                <w:sz w:val="26"/>
+                <w:szCs w:val="26"/>
+              </w:rPr>
+              <w:t>-</w:t>
+            </w:r>
+          </w:p>
+        </w:tc>
+        <w:tc>
+          <w:tcPr>
+            <w:tcW w:w="718" w:type="dxa"/>
+            <w:shd w:val="clear" w:color="auto" w:fill="auto"/>
+          </w:tcPr>
+          <w:p>
+            <w:pPr>
+              <w:spacing w:line="360" w:lineRule="auto"/>
+              <w:jc w:val="center"/>
+              <w:rPr>
+                <w:sz w:val="26"/>
+                <w:szCs w:val="26"/>
+              </w:rPr>
+            </w:pPr>
+            <w:r>
+              <w:rPr>
+                <w:sz w:val="26"/>
+                <w:szCs w:val="26"/>
+              </w:rPr>
+              <w:t>1.5136</w:t>
+            </w:r>
+          </w:p>
+        </w:tc>
+        <w:tc>
+          <w:tcPr>
+            <w:tcW w:w="750" w:type="dxa"/>
+            <w:shd w:val="clear" w:color="auto" w:fill="auto"/>
+          </w:tcPr>
+          <w:p>
+            <w:pPr>
+              <w:spacing w:line="360" w:lineRule="auto"/>
+              <w:jc w:val="center"/>
+              <w:rPr>
+                <w:sz w:val="26"/>
+                <w:szCs w:val="26"/>
+              </w:rPr>
+            </w:pPr>
+            <w:r>
+              <w:rPr>
+                <w:sz w:val="26"/>
+                <w:szCs w:val="26"/>
+              </w:rPr>
+              <w:t>5.2291</w:t>
+            </w:r>
           </w:p>
         </w:tc>
       </w:tr>
@@ -4481,6 +6777,292 @@
           <w:szCs w:val="26"/>
         </w:rPr>
       </w:pPr>
+      <w:r>
+        <w:rPr>
+          <w:sz w:val="26"/>
+          <w:szCs w:val="26"/>
+        </w:rPr>
+        <w:t>Ошибки вычислений методов:</w:t>
+      </w:r>
+    </w:p>
+    <w:p>
+      <w:pPr>
+        <w:spacing w:line="360" w:lineRule="auto"/>
+        <w:jc w:val="both"/>
+        <w:rPr>
+          <w:sz w:val="26"/>
+          <w:szCs w:val="26"/>
+        </w:rPr>
+      </w:pPr>
+      <w:r>
+        <w:rPr>
+          <w:i/>
+          <w:iCs/>
+          <w:sz w:val="26"/>
+          <w:szCs w:val="26"/>
+          <w:lang w:val="en-US"/>
+        </w:rPr>
+        <w:t>f</w:t>
+      </w:r>
+      <w:r>
+        <w:rPr>
+          <w:i/>
+          <w:iCs/>
+          <w:sz w:val="26"/>
+          <w:szCs w:val="26"/>
+        </w:rPr>
+        <w:t>’(</w:t>
+      </w:r>
+      <w:r>
+        <w:rPr>
+          <w:i/>
+          <w:iCs/>
+          <w:sz w:val="26"/>
+          <w:szCs w:val="26"/>
+          <w:lang w:val="en-US"/>
+        </w:rPr>
+        <w:t>x</w:t>
+      </w:r>
+      <w:r>
+        <w:rPr>
+          <w:i/>
+          <w:iCs/>
+          <w:sz w:val="26"/>
+          <w:szCs w:val="26"/>
+        </w:rPr>
+        <w:t>)</w:t>
+      </w:r>
+      <w:r>
+        <w:rPr>
+          <w:sz w:val="26"/>
+          <w:szCs w:val="26"/>
+        </w:rPr>
+        <w:t xml:space="preserve"> слева</w:t>
+      </w:r>
+      <w:r>
+        <w:rPr>
+          <w:sz w:val="26"/>
+          <w:szCs w:val="26"/>
+        </w:rPr>
+        <w:tab/>
+      </w:r>
+      <w:r>
+        <w:rPr>
+          <w:sz w:val="26"/>
+          <w:szCs w:val="26"/>
+        </w:rPr>
+        <w:t>0.8655</w:t>
+      </w:r>
+    </w:p>
+    <w:p>
+      <w:pPr>
+        <w:spacing w:line="360" w:lineRule="auto"/>
+        <w:jc w:val="both"/>
+        <w:rPr>
+          <w:sz w:val="26"/>
+          <w:szCs w:val="26"/>
+        </w:rPr>
+      </w:pPr>
+      <w:r>
+        <w:rPr>
+          <w:i/>
+          <w:iCs/>
+          <w:sz w:val="26"/>
+          <w:szCs w:val="26"/>
+          <w:lang w:val="en-US"/>
+        </w:rPr>
+        <w:t>f</w:t>
+      </w:r>
+      <w:r>
+        <w:rPr>
+          <w:i/>
+          <w:iCs/>
+          <w:sz w:val="26"/>
+          <w:szCs w:val="26"/>
+        </w:rPr>
+        <w:t>’(</w:t>
+      </w:r>
+      <w:r>
+        <w:rPr>
+          <w:i/>
+          <w:iCs/>
+          <w:sz w:val="26"/>
+          <w:szCs w:val="26"/>
+          <w:lang w:val="en-US"/>
+        </w:rPr>
+        <w:t>x</w:t>
+      </w:r>
+      <w:r>
+        <w:rPr>
+          <w:i/>
+          <w:iCs/>
+          <w:sz w:val="26"/>
+          <w:szCs w:val="26"/>
+        </w:rPr>
+        <w:t>)</w:t>
+      </w:r>
+      <w:r>
+        <w:rPr>
+          <w:sz w:val="26"/>
+          <w:szCs w:val="26"/>
+        </w:rPr>
+        <w:t xml:space="preserve"> справа</w:t>
+      </w:r>
+      <w:r>
+        <w:rPr>
+          <w:sz w:val="26"/>
+          <w:szCs w:val="26"/>
+        </w:rPr>
+        <w:tab/>
+      </w:r>
+      <w:r>
+        <w:rPr>
+          <w:sz w:val="26"/>
+          <w:szCs w:val="26"/>
+        </w:rPr>
+        <w:t>0.9549</w:t>
+      </w:r>
+    </w:p>
+    <w:p>
+      <w:pPr>
+        <w:spacing w:line="360" w:lineRule="auto"/>
+        <w:jc w:val="both"/>
+        <w:rPr>
+          <w:sz w:val="26"/>
+          <w:szCs w:val="26"/>
+        </w:rPr>
+      </w:pPr>
+      <w:r>
+        <w:rPr>
+          <w:i/>
+          <w:iCs/>
+          <w:sz w:val="26"/>
+          <w:szCs w:val="26"/>
+          <w:lang w:val="en-US"/>
+        </w:rPr>
+        <w:t>f</w:t>
+      </w:r>
+      <w:r>
+        <w:rPr>
+          <w:i/>
+          <w:iCs/>
+          <w:sz w:val="26"/>
+          <w:szCs w:val="26"/>
+        </w:rPr>
+        <w:t>’(</w:t>
+      </w:r>
+      <w:r>
+        <w:rPr>
+          <w:i/>
+          <w:iCs/>
+          <w:sz w:val="26"/>
+          <w:szCs w:val="26"/>
+          <w:lang w:val="en-US"/>
+        </w:rPr>
+        <w:t>x</w:t>
+      </w:r>
+      <w:r>
+        <w:rPr>
+          <w:i/>
+          <w:iCs/>
+          <w:sz w:val="26"/>
+          <w:szCs w:val="26"/>
+        </w:rPr>
+        <w:t>)</w:t>
+      </w:r>
+      <w:r>
+        <w:rPr>
+          <w:sz w:val="26"/>
+          <w:szCs w:val="26"/>
+        </w:rPr>
+        <w:t xml:space="preserve"> центр</w:t>
+      </w:r>
+      <w:r>
+        <w:rPr>
+          <w:sz w:val="26"/>
+          <w:szCs w:val="26"/>
+        </w:rPr>
+        <w:tab/>
+      </w:r>
+      <w:r>
+        <w:rPr>
+          <w:sz w:val="26"/>
+          <w:szCs w:val="26"/>
+        </w:rPr>
+        <w:t>0.2883</w:t>
+      </w:r>
+    </w:p>
+    <w:p>
+      <w:pPr>
+        <w:jc w:val="both"/>
+        <w:rPr>
+          <w:sz w:val="26"/>
+          <w:szCs w:val="26"/>
+        </w:rPr>
+      </w:pPr>
+      <w:r>
+        <w:rPr>
+          <w:i/>
+          <w:iCs/>
+          <w:sz w:val="26"/>
+          <w:szCs w:val="26"/>
+          <w:lang w:val="en-US"/>
+        </w:rPr>
+        <w:t>f</w:t>
+      </w:r>
+      <w:r>
+        <w:rPr>
+          <w:i/>
+          <w:iCs/>
+          <w:sz w:val="26"/>
+          <w:szCs w:val="26"/>
+        </w:rPr>
+        <w:t>’’(</w:t>
+      </w:r>
+      <w:r>
+        <w:rPr>
+          <w:i/>
+          <w:iCs/>
+          <w:sz w:val="26"/>
+          <w:szCs w:val="26"/>
+          <w:lang w:val="en-US"/>
+        </w:rPr>
+        <w:t>x</w:t>
+      </w:r>
+      <w:r>
+        <w:rPr>
+          <w:i/>
+          <w:iCs/>
+          <w:sz w:val="26"/>
+          <w:szCs w:val="26"/>
+        </w:rPr>
+        <w:t>)</w:t>
+      </w:r>
+      <w:r>
+        <w:rPr>
+          <w:i/>
+          <w:iCs/>
+          <w:sz w:val="26"/>
+          <w:szCs w:val="26"/>
+        </w:rPr>
+        <w:tab/>
+      </w:r>
+      <w:r>
+        <w:rPr>
+          <w:i/>
+          <w:iCs/>
+          <w:sz w:val="26"/>
+          <w:szCs w:val="26"/>
+        </w:rPr>
+        <w:tab/>
+      </w:r>
+      <w:r>
+        <w:rPr>
+          <w:sz w:val="26"/>
+          <w:szCs w:val="26"/>
+        </w:rPr>
+        <w:t>0.6384</w:t>
+      </w:r>
     </w:p>
     <w:sectPr>
       <w:pgSz w:w="11906" w:h="16838"/>
@@ -8449,7 +11031,7 @@
   <w:style w:type="paragraph" w:default="1" w:styleId="a">
     <w:name w:val="Normal"/>
     <w:qFormat/>
-    <w:rsid w:val="001F2703"/>
+    <w:rsid w:val="00714F1D"/>
     <w:pPr>
       <w:spacing w:after="0" w:line="240" w:lineRule="auto"/>
     </w:pPr>
@@ -8479,6 +11061,7 @@
   <w:style w:type="character" w:default="1" w:styleId="a0">
     <w:name w:val="Default Paragraph Font"/>
     <w:uiPriority w:val="1"/>
+    <w:semiHidden/>
     <w:unhideWhenUsed/>
   </w:style>
   <w:style w:type="table" w:default="1" w:styleId="a1">
@@ -8678,6 +11261,17 @@
       <w:szCs w:val="16"/>
       <w:lang w:eastAsia="en-US"/>
     </w:rPr>
+  </w:style>
+  <w:style w:type="paragraph" w:styleId="af">
+    <w:name w:val="List Paragraph"/>
+    <w:basedOn w:val="a"/>
+    <w:uiPriority w:val="34"/>
+    <w:qFormat/>
+    <w:rsid w:val="00714F1D"/>
+    <w:pPr>
+      <w:ind w:left="720"/>
+      <w:contextualSpacing/>
+    </w:pPr>
   </w:style>
 </w:styles>
 </file>

</xml_diff>